<commit_message>
To Add List View inside Home Page with Bangla and English Language
</commit_message>
<xml_diff>
--- a/documents/whole app works step-by-step(17-05-2026).docx
+++ b/documents/whole app works step-by-step(17-05-2026).docx
@@ -16,8 +16,13 @@
     </w:p>
     <w:p/>
     <w:p>
-      <w:r>
-        <w:t>Date : 17-05-2026</w:t>
+      <w:proofErr w:type="gramStart"/>
+      <w:r>
+        <w:t>Date :</w:t>
+      </w:r>
+      <w:proofErr w:type="gramEnd"/>
+      <w:r>
+        <w:t xml:space="preserve"> 17-05-2026</w:t>
       </w:r>
     </w:p>
     <w:p/>
@@ -163,6 +168,7 @@
     </w:p>
     <w:p/>
     <w:p/>
+    <w:p/>
     <w:p>
       <w:r>
         <w:t>Your structure is now good enough to start building the app properly.</w:t>
@@ -182,6 +188,10 @@
         <w:t xml:space="preserve"> using your current Cubit architecture.</w:t>
       </w:r>
     </w:p>
+    <w:p/>
+    <w:p/>
+    <w:p/>
+    <w:p/>
     <w:p>
       <w:r>
         <w:pict w14:anchorId="5914B95D">
@@ -202,6 +212,7 @@
           <w:b/>
           <w:bCs/>
         </w:rPr>
+        <w:lastRenderedPageBreak/>
         <w:t>🧠</w:t>
       </w:r>
       <w:r>
@@ -218,26 +229,31 @@
       </w:r>
     </w:p>
     <w:p>
+      <w:proofErr w:type="spellStart"/>
+      <w:proofErr w:type="gramStart"/>
       <w:r>
         <w:t>main.dart</w:t>
       </w:r>
+      <w:proofErr w:type="spellEnd"/>
+      <w:proofErr w:type="gramEnd"/>
       <w:r>
         <w:br/>
         <w:t xml:space="preserve">   ↓</w:t>
       </w:r>
       <w:r>
         <w:br/>
+      </w:r>
+      <w:proofErr w:type="spellStart"/>
+      <w:r>
         <w:t>HomeScreen</w:t>
       </w:r>
+      <w:proofErr w:type="spellEnd"/>
       <w:r>
         <w:br/>
         <w:t xml:space="preserve">   ↓</w:t>
       </w:r>
       <w:r>
         <w:br/>
-      </w:r>
-      <w:r>
-        <w:lastRenderedPageBreak/>
         <w:t>Cubit manages state</w:t>
       </w:r>
       <w:r>
@@ -301,7 +317,15 @@
       </w:r>
       <w:r>
         <w:br/>
-        <w:t>features/hajj/  → complete Hajj module</w:t>
+        <w:t>features/hajj</w:t>
+      </w:r>
+      <w:proofErr w:type="gramStart"/>
+      <w:r>
+        <w:t>/  →</w:t>
+      </w:r>
+      <w:proofErr w:type="gramEnd"/>
+      <w:r>
+        <w:t xml:space="preserve"> complete Hajj module</w:t>
       </w:r>
       <w:r>
         <w:br/>
@@ -373,8 +397,19 @@
           <w:b/>
           <w:bCs/>
         </w:rPr>
-        <w:t xml:space="preserve"> main.dart</w:t>
-      </w:r>
+        <w:t xml:space="preserve"> </w:t>
+      </w:r>
+      <w:proofErr w:type="spellStart"/>
+      <w:proofErr w:type="gramStart"/>
+      <w:r>
+        <w:rPr>
+          <w:b/>
+          <w:bCs/>
+        </w:rPr>
+        <w:t>main.dart</w:t>
+      </w:r>
+      <w:proofErr w:type="spellEnd"/>
+      <w:proofErr w:type="gramEnd"/>
     </w:p>
     <w:p>
       <w:pPr>
@@ -421,7 +456,15 @@
         </w:numPr>
       </w:pPr>
       <w:r>
-        <w:t xml:space="preserve">Loads HomeScreen </w:t>
+        <w:t xml:space="preserve">Loads </w:t>
+      </w:r>
+      <w:proofErr w:type="spellStart"/>
+      <w:r>
+        <w:t>HomeScreen</w:t>
+      </w:r>
+      <w:proofErr w:type="spellEnd"/>
+      <w:r>
+        <w:t xml:space="preserve"> </w:t>
       </w:r>
     </w:p>
     <w:p>
@@ -451,27 +494,87 @@
           <w:b/>
           <w:bCs/>
         </w:rPr>
-        <w:t xml:space="preserve"> main.dart</w:t>
-      </w:r>
-    </w:p>
-    <w:p>
-      <w:r>
-        <w:t>import 'package:flutter/material.dart';</w:t>
-      </w:r>
-      <w:r>
-        <w:br/>
-        <w:t>import 'package:flutter_bloc/flutter_bloc.dart';</w:t>
-      </w:r>
-      <w:r>
-        <w:br/>
-      </w:r>
-      <w:r>
-        <w:br/>
-        <w:t>import 'features/hajj/presentation/cubit/hajj/hajj_cubit.dart';</w:t>
-      </w:r>
-      <w:r>
-        <w:br/>
-        <w:t>import 'features/hajj/presentation/pages/home/home_screen.dart';</w:t>
+        <w:t xml:space="preserve"> </w:t>
+      </w:r>
+      <w:proofErr w:type="spellStart"/>
+      <w:proofErr w:type="gramStart"/>
+      <w:r>
+        <w:rPr>
+          <w:b/>
+          <w:bCs/>
+        </w:rPr>
+        <w:t>main.dart</w:t>
+      </w:r>
+      <w:proofErr w:type="spellEnd"/>
+      <w:proofErr w:type="gramEnd"/>
+    </w:p>
+    <w:p>
+      <w:r>
+        <w:lastRenderedPageBreak/>
+        <w:t>import '</w:t>
+      </w:r>
+      <w:proofErr w:type="spellStart"/>
+      <w:r>
+        <w:t>package:flutter</w:t>
+      </w:r>
+      <w:proofErr w:type="spellEnd"/>
+      <w:r>
+        <w:t>/</w:t>
+      </w:r>
+      <w:proofErr w:type="spellStart"/>
+      <w:r>
+        <w:t>material.dart</w:t>
+      </w:r>
+      <w:proofErr w:type="spellEnd"/>
+      <w:r>
+        <w:t>';</w:t>
+      </w:r>
+      <w:r>
+        <w:br/>
+        <w:t>import '</w:t>
+      </w:r>
+      <w:proofErr w:type="spellStart"/>
+      <w:r>
+        <w:t>package:flutter_bloc</w:t>
+      </w:r>
+      <w:proofErr w:type="spellEnd"/>
+      <w:r>
+        <w:t>/</w:t>
+      </w:r>
+      <w:proofErr w:type="spellStart"/>
+      <w:r>
+        <w:t>flutter_bloc.dart</w:t>
+      </w:r>
+      <w:proofErr w:type="spellEnd"/>
+      <w:r>
+        <w:t>';</w:t>
+      </w:r>
+      <w:r>
+        <w:br/>
+      </w:r>
+      <w:r>
+        <w:br/>
+        <w:t>import 'features/hajj/presentation/cubit/hajj/</w:t>
+      </w:r>
+      <w:proofErr w:type="spellStart"/>
+      <w:r>
+        <w:t>hajj_cubit.dart</w:t>
+      </w:r>
+      <w:proofErr w:type="spellEnd"/>
+      <w:r>
+        <w:t>';</w:t>
+      </w:r>
+      <w:r>
+        <w:br/>
+        <w:t>import 'features/hajj/presentation/pages/home/</w:t>
+      </w:r>
+      <w:proofErr w:type="spellStart"/>
+      <w:r>
+        <w:t>home_screen.dart</w:t>
+      </w:r>
+      <w:proofErr w:type="spellEnd"/>
+      <w:r>
+        <w:t>';</w:t>
       </w:r>
       <w:r>
         <w:br/>
@@ -482,10 +585,23 @@
       </w:r>
       <w:r>
         <w:br/>
-      </w:r>
-      <w:r>
-        <w:lastRenderedPageBreak/>
-        <w:t xml:space="preserve">  runApp(const MyApp());</w:t>
+        <w:t xml:space="preserve">  </w:t>
+      </w:r>
+      <w:proofErr w:type="spellStart"/>
+      <w:r>
+        <w:t>runApp</w:t>
+      </w:r>
+      <w:proofErr w:type="spellEnd"/>
+      <w:r>
+        <w:t xml:space="preserve">(const </w:t>
+      </w:r>
+      <w:proofErr w:type="spellStart"/>
+      <w:r>
+        <w:t>MyApp</w:t>
+      </w:r>
+      <w:proofErr w:type="spellEnd"/>
+      <w:r>
+        <w:t>());</w:t>
       </w:r>
       <w:r>
         <w:br/>
@@ -496,11 +612,43 @@
       </w:r>
       <w:r>
         <w:br/>
-        <w:t>class MyApp extends StatelessWidget {</w:t>
-      </w:r>
-      <w:r>
-        <w:br/>
-        <w:t xml:space="preserve">  const MyApp({super.key});</w:t>
+        <w:t xml:space="preserve">class </w:t>
+      </w:r>
+      <w:proofErr w:type="spellStart"/>
+      <w:r>
+        <w:t>MyApp</w:t>
+      </w:r>
+      <w:proofErr w:type="spellEnd"/>
+      <w:r>
+        <w:t xml:space="preserve"> extends </w:t>
+      </w:r>
+      <w:proofErr w:type="spellStart"/>
+      <w:r>
+        <w:t>StatelessWidget</w:t>
+      </w:r>
+      <w:proofErr w:type="spellEnd"/>
+      <w:r>
+        <w:t xml:space="preserve"> {</w:t>
+      </w:r>
+      <w:r>
+        <w:br/>
+        <w:t xml:space="preserve">  const </w:t>
+      </w:r>
+      <w:proofErr w:type="spellStart"/>
+      <w:r>
+        <w:t>MyApp</w:t>
+      </w:r>
+      <w:proofErr w:type="spellEnd"/>
+      <w:r>
+        <w:t>({</w:t>
+      </w:r>
+      <w:proofErr w:type="spellStart"/>
+      <w:r>
+        <w:t>super.key</w:t>
+      </w:r>
+      <w:proofErr w:type="spellEnd"/>
+      <w:r>
+        <w:t>});</w:t>
       </w:r>
       <w:r>
         <w:br/>
@@ -511,27 +659,75 @@
       </w:r>
       <w:r>
         <w:br/>
-        <w:t xml:space="preserve">  Widget build(BuildContext context) {</w:t>
-      </w:r>
-      <w:r>
-        <w:br/>
-        <w:t xml:space="preserve">    return BlocProvider(</w:t>
-      </w:r>
-      <w:r>
-        <w:br/>
-        <w:t xml:space="preserve">      create: (_) =&gt; HajjCubit(),</w:t>
-      </w:r>
-      <w:r>
-        <w:br/>
-        <w:t xml:space="preserve">      child: MaterialApp(</w:t>
-      </w:r>
-      <w:r>
-        <w:br/>
-        <w:t xml:space="preserve">        debugShowCheckedModeBanner: false,</w:t>
-      </w:r>
-      <w:r>
-        <w:br/>
-        <w:t xml:space="preserve">        home: const HomeScreen(),</w:t>
+        <w:t xml:space="preserve">  Widget build(</w:t>
+      </w:r>
+      <w:proofErr w:type="spellStart"/>
+      <w:r>
+        <w:t>BuildContext</w:t>
+      </w:r>
+      <w:proofErr w:type="spellEnd"/>
+      <w:r>
+        <w:t xml:space="preserve"> context) {</w:t>
+      </w:r>
+      <w:r>
+        <w:br/>
+        <w:t xml:space="preserve">    return </w:t>
+      </w:r>
+      <w:proofErr w:type="spellStart"/>
+      <w:r>
+        <w:t>BlocProvider</w:t>
+      </w:r>
+      <w:proofErr w:type="spellEnd"/>
+      <w:r>
+        <w:t>(</w:t>
+      </w:r>
+      <w:r>
+        <w:br/>
+        <w:t xml:space="preserve">      create: (_) =&gt; </w:t>
+      </w:r>
+      <w:proofErr w:type="spellStart"/>
+      <w:r>
+        <w:t>HajjCubit</w:t>
+      </w:r>
+      <w:proofErr w:type="spellEnd"/>
+      <w:r>
+        <w:t>(),</w:t>
+      </w:r>
+      <w:r>
+        <w:br/>
+        <w:t xml:space="preserve">      child: </w:t>
+      </w:r>
+      <w:proofErr w:type="spellStart"/>
+      <w:r>
+        <w:t>MaterialApp</w:t>
+      </w:r>
+      <w:proofErr w:type="spellEnd"/>
+      <w:r>
+        <w:t>(</w:t>
+      </w:r>
+      <w:r>
+        <w:br/>
+        <w:t xml:space="preserve">        </w:t>
+      </w:r>
+      <w:proofErr w:type="spellStart"/>
+      <w:r>
+        <w:t>debugShowCheckedModeBanner</w:t>
+      </w:r>
+      <w:proofErr w:type="spellEnd"/>
+      <w:r>
+        <w:t>: false,</w:t>
+      </w:r>
+      <w:r>
+        <w:br/>
+        <w:t xml:space="preserve">        home: const </w:t>
+      </w:r>
+      <w:proofErr w:type="spellStart"/>
+      <w:r>
+        <w:t>HomeScreen</w:t>
+      </w:r>
+      <w:proofErr w:type="spellEnd"/>
+      <w:r>
+        <w:t>(),</w:t>
       </w:r>
       <w:r>
         <w:br/>
@@ -577,8 +773,26 @@
           <w:b/>
           <w:bCs/>
         </w:rPr>
-        <w:t xml:space="preserve"> menu_item_model.dart</w:t>
-      </w:r>
+        <w:t xml:space="preserve"> </w:t>
+      </w:r>
+      <w:proofErr w:type="spellStart"/>
+      <w:r>
+        <w:rPr>
+          <w:b/>
+          <w:bCs/>
+        </w:rPr>
+        <w:t>menu_item_</w:t>
+      </w:r>
+      <w:proofErr w:type="gramStart"/>
+      <w:r>
+        <w:rPr>
+          <w:b/>
+          <w:bCs/>
+        </w:rPr>
+        <w:t>model.dart</w:t>
+      </w:r>
+      <w:proofErr w:type="spellEnd"/>
+      <w:proofErr w:type="gramEnd"/>
     </w:p>
     <w:p>
       <w:pPr>
@@ -608,12 +822,25 @@
         <w:t>📍</w:t>
       </w:r>
       <w:r>
-        <w:t xml:space="preserve"> data/models/menu_item_model.dart</w:t>
-      </w:r>
-    </w:p>
-    <w:p>
-      <w:r>
-        <w:t>class MenuItemModel {</w:t>
+        <w:t xml:space="preserve"> data/models/</w:t>
+      </w:r>
+      <w:proofErr w:type="spellStart"/>
+      <w:r>
+        <w:t>menu_item_model.dart</w:t>
+      </w:r>
+      <w:proofErr w:type="spellEnd"/>
+    </w:p>
+    <w:p>
+      <w:r>
+        <w:t xml:space="preserve">class </w:t>
+      </w:r>
+      <w:proofErr w:type="spellStart"/>
+      <w:r>
+        <w:t>MenuItemModel</w:t>
+      </w:r>
+      <w:proofErr w:type="spellEnd"/>
+      <w:r>
+        <w:t xml:space="preserve"> {</w:t>
       </w:r>
       <w:r>
         <w:br/>
@@ -628,15 +855,46 @@
       </w:r>
       <w:r>
         <w:br/>
-        <w:t xml:space="preserve">  MenuItemModel({</w:t>
-      </w:r>
-      <w:r>
-        <w:br/>
-        <w:t xml:space="preserve">    required this.title,</w:t>
-      </w:r>
-      <w:r>
-        <w:br/>
-        <w:t xml:space="preserve">    required this.icon,</w:t>
+        <w:t xml:space="preserve">  </w:t>
+      </w:r>
+      <w:proofErr w:type="spellStart"/>
+      <w:r>
+        <w:t>MenuItemModel</w:t>
+      </w:r>
+      <w:proofErr w:type="spellEnd"/>
+      <w:r>
+        <w:t>({</w:t>
+      </w:r>
+      <w:r>
+        <w:br/>
+        <w:t xml:space="preserve">    required </w:t>
+      </w:r>
+      <w:proofErr w:type="spellStart"/>
+      <w:proofErr w:type="gramStart"/>
+      <w:r>
+        <w:t>this.title</w:t>
+      </w:r>
+      <w:proofErr w:type="spellEnd"/>
+      <w:proofErr w:type="gramEnd"/>
+      <w:r>
+        <w:t>,</w:t>
+      </w:r>
+      <w:r>
+        <w:br/>
+      </w:r>
+      <w:r>
+        <w:lastRenderedPageBreak/>
+        <w:t xml:space="preserve">    required </w:t>
+      </w:r>
+      <w:proofErr w:type="spellStart"/>
+      <w:proofErr w:type="gramStart"/>
+      <w:r>
+        <w:t>this.icon</w:t>
+      </w:r>
+      <w:proofErr w:type="spellEnd"/>
+      <w:proofErr w:type="gramEnd"/>
+      <w:r>
+        <w:t>,</w:t>
       </w:r>
       <w:r>
         <w:br/>
@@ -674,22 +932,39 @@
           <w:b/>
           <w:bCs/>
         </w:rPr>
-        <w:t xml:space="preserve"> menu_data.dart</w:t>
-      </w:r>
-    </w:p>
-    <w:p>
-      <w:pPr>
-        <w:rPr>
-          <w:b/>
-          <w:bCs/>
-        </w:rPr>
-      </w:pPr>
-      <w:r>
-        <w:rPr>
-          <w:b/>
-          <w:bCs/>
-        </w:rPr>
-        <w:lastRenderedPageBreak/>
+        <w:t xml:space="preserve"> </w:t>
+      </w:r>
+      <w:proofErr w:type="spellStart"/>
+      <w:r>
+        <w:rPr>
+          <w:b/>
+          <w:bCs/>
+        </w:rPr>
+        <w:t>menu_</w:t>
+      </w:r>
+      <w:proofErr w:type="gramStart"/>
+      <w:r>
+        <w:rPr>
+          <w:b/>
+          <w:bCs/>
+        </w:rPr>
+        <w:t>data.dart</w:t>
+      </w:r>
+      <w:proofErr w:type="spellEnd"/>
+      <w:proofErr w:type="gramEnd"/>
+    </w:p>
+    <w:p>
+      <w:pPr>
+        <w:rPr>
+          <w:b/>
+          <w:bCs/>
+        </w:rPr>
+      </w:pPr>
+      <w:r>
+        <w:rPr>
+          <w:b/>
+          <w:bCs/>
+        </w:rPr>
         <w:t>Responsibility</w:t>
       </w:r>
     </w:p>
@@ -706,27 +981,80 @@
         <w:t>📍</w:t>
       </w:r>
       <w:r>
-        <w:t xml:space="preserve"> data/data_sources/menu_data.dart</w:t>
-      </w:r>
-    </w:p>
-    <w:p>
-      <w:r>
-        <w:t>import '../models/menu_item_model.dart';</w:t>
-      </w:r>
-      <w:r>
-        <w:br/>
-      </w:r>
-      <w:r>
-        <w:br/>
-        <w:t>class MenuData {</w:t>
-      </w:r>
-      <w:r>
-        <w:br/>
-        <w:t xml:space="preserve">  static List&lt;MenuItemModel&gt; homeMenu = [</w:t>
-      </w:r>
-      <w:r>
-        <w:br/>
-        <w:t xml:space="preserve">    MenuItemModel(title: "Hajj", icon: "</w:t>
+        <w:t xml:space="preserve"> data/</w:t>
+      </w:r>
+      <w:proofErr w:type="spellStart"/>
+      <w:r>
+        <w:t>data_sources</w:t>
+      </w:r>
+      <w:proofErr w:type="spellEnd"/>
+      <w:r>
+        <w:t>/</w:t>
+      </w:r>
+      <w:proofErr w:type="spellStart"/>
+      <w:r>
+        <w:t>menu_data.dart</w:t>
+      </w:r>
+      <w:proofErr w:type="spellEnd"/>
+    </w:p>
+    <w:p>
+      <w:r>
+        <w:t>import '../models/</w:t>
+      </w:r>
+      <w:proofErr w:type="spellStart"/>
+      <w:r>
+        <w:t>menu_item_model.dart</w:t>
+      </w:r>
+      <w:proofErr w:type="spellEnd"/>
+      <w:r>
+        <w:t>';</w:t>
+      </w:r>
+      <w:r>
+        <w:br/>
+      </w:r>
+      <w:r>
+        <w:br/>
+        <w:t xml:space="preserve">class </w:t>
+      </w:r>
+      <w:proofErr w:type="spellStart"/>
+      <w:r>
+        <w:t>MenuData</w:t>
+      </w:r>
+      <w:proofErr w:type="spellEnd"/>
+      <w:r>
+        <w:t xml:space="preserve"> {</w:t>
+      </w:r>
+      <w:r>
+        <w:br/>
+        <w:t xml:space="preserve">  static List&lt;</w:t>
+      </w:r>
+      <w:proofErr w:type="spellStart"/>
+      <w:r>
+        <w:t>MenuItemModel</w:t>
+      </w:r>
+      <w:proofErr w:type="spellEnd"/>
+      <w:r>
+        <w:t xml:space="preserve">&gt; </w:t>
+      </w:r>
+      <w:proofErr w:type="spellStart"/>
+      <w:r>
+        <w:t>homeMenu</w:t>
+      </w:r>
+      <w:proofErr w:type="spellEnd"/>
+      <w:r>
+        <w:t xml:space="preserve"> = [</w:t>
+      </w:r>
+      <w:r>
+        <w:br/>
+        <w:t xml:space="preserve">    </w:t>
+      </w:r>
+      <w:proofErr w:type="spellStart"/>
+      <w:r>
+        <w:t>MenuItemModel</w:t>
+      </w:r>
+      <w:proofErr w:type="spellEnd"/>
+      <w:r>
+        <w:t>(title: "Hajj", icon: "</w:t>
       </w:r>
       <w:r>
         <w:rPr>
@@ -739,7 +1067,15 @@
       </w:r>
       <w:r>
         <w:br/>
-        <w:t xml:space="preserve">    MenuItemModel(title: "Umrah", icon: "</w:t>
+        <w:t xml:space="preserve">    </w:t>
+      </w:r>
+      <w:proofErr w:type="spellStart"/>
+      <w:r>
+        <w:t>MenuItemModel</w:t>
+      </w:r>
+      <w:proofErr w:type="spellEnd"/>
+      <w:r>
+        <w:t>(title: "Umrah", icon: "</w:t>
       </w:r>
       <w:r>
         <w:rPr>
@@ -759,11 +1095,35 @@
       </w:r>
       <w:r>
         <w:br/>
-        <w:t xml:space="preserve">  static List&lt;MenuItemModel&gt; bottomMenu = [</w:t>
-      </w:r>
-      <w:r>
-        <w:br/>
-        <w:t xml:space="preserve">    MenuItemModel(title: "Safar", icon: "</w:t>
+        <w:t xml:space="preserve">  static List&lt;</w:t>
+      </w:r>
+      <w:proofErr w:type="spellStart"/>
+      <w:r>
+        <w:t>MenuItemModel</w:t>
+      </w:r>
+      <w:proofErr w:type="spellEnd"/>
+      <w:r>
+        <w:t xml:space="preserve">&gt; </w:t>
+      </w:r>
+      <w:proofErr w:type="spellStart"/>
+      <w:r>
+        <w:t>bottomMenu</w:t>
+      </w:r>
+      <w:proofErr w:type="spellEnd"/>
+      <w:r>
+        <w:t xml:space="preserve"> = [</w:t>
+      </w:r>
+      <w:r>
+        <w:br/>
+        <w:t xml:space="preserve">    </w:t>
+      </w:r>
+      <w:proofErr w:type="spellStart"/>
+      <w:r>
+        <w:t>MenuItemModel</w:t>
+      </w:r>
+      <w:proofErr w:type="spellEnd"/>
+      <w:r>
+        <w:t>(title: "Safar", icon: "</w:t>
       </w:r>
       <w:r>
         <w:rPr>
@@ -776,7 +1136,15 @@
       </w:r>
       <w:r>
         <w:br/>
-        <w:t xml:space="preserve">    MenuItemModel(title: "Preparation", icon: "</w:t>
+        <w:t xml:space="preserve">    </w:t>
+      </w:r>
+      <w:proofErr w:type="spellStart"/>
+      <w:r>
+        <w:t>MenuItemModel</w:t>
+      </w:r>
+      <w:proofErr w:type="spellEnd"/>
+      <w:r>
+        <w:t>(title: "Preparation", icon: "</w:t>
       </w:r>
       <w:r>
         <w:rPr>
@@ -789,7 +1157,15 @@
       </w:r>
       <w:r>
         <w:br/>
-        <w:t xml:space="preserve">    MenuItemModel(title: "Essentials", icon: "</w:t>
+        <w:t xml:space="preserve">    </w:t>
+      </w:r>
+      <w:proofErr w:type="spellStart"/>
+      <w:r>
+        <w:t>MenuItemModel</w:t>
+      </w:r>
+      <w:proofErr w:type="spellEnd"/>
+      <w:r>
+        <w:t>(title: "Essentials", icon: "</w:t>
       </w:r>
       <w:r>
         <w:rPr>
@@ -802,7 +1178,15 @@
       </w:r>
       <w:r>
         <w:br/>
-        <w:t xml:space="preserve">    MenuItemModel(title: "Makkah", icon: "</w:t>
+        <w:t xml:space="preserve">    </w:t>
+      </w:r>
+      <w:proofErr w:type="spellStart"/>
+      <w:r>
+        <w:t>MenuItemModel</w:t>
+      </w:r>
+      <w:proofErr w:type="spellEnd"/>
+      <w:r>
+        <w:t>(title: "Makkah", icon: "</w:t>
       </w:r>
       <w:r>
         <w:rPr>
@@ -815,7 +1199,15 @@
       </w:r>
       <w:r>
         <w:br/>
-        <w:t xml:space="preserve">    MenuItemModel(title: "Madinah", icon: "</w:t>
+        <w:t xml:space="preserve">    </w:t>
+      </w:r>
+      <w:proofErr w:type="spellStart"/>
+      <w:r>
+        <w:t>MenuItemModel</w:t>
+      </w:r>
+      <w:proofErr w:type="spellEnd"/>
+      <w:r>
+        <w:t>(title: "Madinah", icon: "</w:t>
       </w:r>
       <w:r>
         <w:rPr>
@@ -862,8 +1254,26 @@
           <w:b/>
           <w:bCs/>
         </w:rPr>
-        <w:t xml:space="preserve"> hajj_state.dart</w:t>
-      </w:r>
+        <w:t xml:space="preserve"> </w:t>
+      </w:r>
+      <w:proofErr w:type="spellStart"/>
+      <w:r>
+        <w:rPr>
+          <w:b/>
+          <w:bCs/>
+        </w:rPr>
+        <w:t>hajj_</w:t>
+      </w:r>
+      <w:proofErr w:type="gramStart"/>
+      <w:r>
+        <w:rPr>
+          <w:b/>
+          <w:bCs/>
+        </w:rPr>
+        <w:t>state.dart</w:t>
+      </w:r>
+      <w:proofErr w:type="spellEnd"/>
+      <w:proofErr w:type="gramEnd"/>
     </w:p>
     <w:p>
       <w:pPr>
@@ -893,8 +1303,13 @@
         <w:t>📍</w:t>
       </w:r>
       <w:r>
-        <w:t xml:space="preserve"> presentation/cubit/hajj/hajj_state.dart</w:t>
-      </w:r>
+        <w:t xml:space="preserve"> presentation/cubit/hajj/</w:t>
+      </w:r>
+      <w:proofErr w:type="spellStart"/>
+      <w:r>
+        <w:t>hajj_state.dart</w:t>
+      </w:r>
+      <w:proofErr w:type="spellEnd"/>
     </w:p>
     <w:p>
       <w:r>
@@ -905,41 +1320,121 @@
       </w:r>
       <w:r>
         <w:br/>
-        <w:t>class HajjState {</w:t>
-      </w:r>
-      <w:r>
-        <w:br/>
-        <w:t xml:space="preserve">  final List&lt;MenuItemModel&gt; homeItems;</w:t>
-      </w:r>
-      <w:r>
-        <w:br/>
-        <w:t xml:space="preserve">  final List&lt;MenuItemModel&gt; bottomItems;</w:t>
-      </w:r>
-      <w:r>
-        <w:br/>
-        <w:t xml:space="preserve">  final int selectedIndex;</w:t>
-      </w:r>
-      <w:r>
-        <w:br/>
-      </w:r>
-      <w:r>
-        <w:br/>
-        <w:t xml:space="preserve">  HajjState({</w:t>
-      </w:r>
-      <w:r>
-        <w:br/>
-        <w:t xml:space="preserve">    required this.homeItems,</w:t>
-      </w:r>
-      <w:r>
-        <w:br/>
       </w:r>
       <w:r>
         <w:lastRenderedPageBreak/>
-        <w:t xml:space="preserve">    required this.bottomItems,</w:t>
-      </w:r>
-      <w:r>
-        <w:br/>
-        <w:t xml:space="preserve">    required this.selectedIndex,</w:t>
+        <w:t xml:space="preserve">class </w:t>
+      </w:r>
+      <w:proofErr w:type="spellStart"/>
+      <w:r>
+        <w:t>HajjState</w:t>
+      </w:r>
+      <w:proofErr w:type="spellEnd"/>
+      <w:r>
+        <w:t xml:space="preserve"> {</w:t>
+      </w:r>
+      <w:r>
+        <w:br/>
+        <w:t xml:space="preserve">  final List&lt;</w:t>
+      </w:r>
+      <w:proofErr w:type="spellStart"/>
+      <w:r>
+        <w:t>MenuItemModel</w:t>
+      </w:r>
+      <w:proofErr w:type="spellEnd"/>
+      <w:r>
+        <w:t xml:space="preserve">&gt; </w:t>
+      </w:r>
+      <w:proofErr w:type="spellStart"/>
+      <w:r>
+        <w:t>homeItems</w:t>
+      </w:r>
+      <w:proofErr w:type="spellEnd"/>
+      <w:r>
+        <w:t>;</w:t>
+      </w:r>
+      <w:r>
+        <w:br/>
+        <w:t xml:space="preserve">  final List&lt;</w:t>
+      </w:r>
+      <w:proofErr w:type="spellStart"/>
+      <w:r>
+        <w:t>MenuItemModel</w:t>
+      </w:r>
+      <w:proofErr w:type="spellEnd"/>
+      <w:r>
+        <w:t xml:space="preserve">&gt; </w:t>
+      </w:r>
+      <w:proofErr w:type="spellStart"/>
+      <w:r>
+        <w:t>bottomItems</w:t>
+      </w:r>
+      <w:proofErr w:type="spellEnd"/>
+      <w:r>
+        <w:t>;</w:t>
+      </w:r>
+      <w:r>
+        <w:br/>
+        <w:t xml:space="preserve">  final int </w:t>
+      </w:r>
+      <w:proofErr w:type="spellStart"/>
+      <w:r>
+        <w:t>selectedIndex</w:t>
+      </w:r>
+      <w:proofErr w:type="spellEnd"/>
+      <w:r>
+        <w:t>;</w:t>
+      </w:r>
+      <w:r>
+        <w:br/>
+      </w:r>
+      <w:r>
+        <w:br/>
+        <w:t xml:space="preserve">  </w:t>
+      </w:r>
+      <w:proofErr w:type="spellStart"/>
+      <w:r>
+        <w:t>HajjState</w:t>
+      </w:r>
+      <w:proofErr w:type="spellEnd"/>
+      <w:r>
+        <w:t>({</w:t>
+      </w:r>
+      <w:r>
+        <w:br/>
+        <w:t xml:space="preserve">    required </w:t>
+      </w:r>
+      <w:proofErr w:type="spellStart"/>
+      <w:r>
+        <w:t>this.homeItems</w:t>
+      </w:r>
+      <w:proofErr w:type="spellEnd"/>
+      <w:r>
+        <w:t>,</w:t>
+      </w:r>
+      <w:r>
+        <w:br/>
+        <w:t xml:space="preserve">    required </w:t>
+      </w:r>
+      <w:proofErr w:type="spellStart"/>
+      <w:r>
+        <w:t>this.bottomItems</w:t>
+      </w:r>
+      <w:proofErr w:type="spellEnd"/>
+      <w:r>
+        <w:t>,</w:t>
+      </w:r>
+      <w:r>
+        <w:br/>
+        <w:t xml:space="preserve">    required </w:t>
+      </w:r>
+      <w:proofErr w:type="spellStart"/>
+      <w:r>
+        <w:t>this.selectedIndex</w:t>
+      </w:r>
+      <w:proofErr w:type="spellEnd"/>
+      <w:r>
+        <w:t>,</w:t>
       </w:r>
       <w:r>
         <w:br/>
@@ -950,23 +1445,63 @@
       </w:r>
       <w:r>
         <w:br/>
-        <w:t xml:space="preserve">  factory HajjState.initial() {</w:t>
-      </w:r>
-      <w:r>
-        <w:br/>
-        <w:t xml:space="preserve">    return HajjState(</w:t>
-      </w:r>
-      <w:r>
-        <w:br/>
-        <w:t xml:space="preserve">      homeItems: [],</w:t>
-      </w:r>
-      <w:r>
-        <w:br/>
-        <w:t xml:space="preserve">      bottomItems: [],</w:t>
-      </w:r>
-      <w:r>
-        <w:br/>
-        <w:t xml:space="preserve">      selectedIndex: 0,</w:t>
+        <w:t xml:space="preserve">  factory </w:t>
+      </w:r>
+      <w:proofErr w:type="spellStart"/>
+      <w:r>
+        <w:t>HajjState.initial</w:t>
+      </w:r>
+      <w:proofErr w:type="spellEnd"/>
+      <w:r>
+        <w:t>() {</w:t>
+      </w:r>
+      <w:r>
+        <w:br/>
+        <w:t xml:space="preserve">    return </w:t>
+      </w:r>
+      <w:proofErr w:type="spellStart"/>
+      <w:r>
+        <w:t>HajjState</w:t>
+      </w:r>
+      <w:proofErr w:type="spellEnd"/>
+      <w:r>
+        <w:t>(</w:t>
+      </w:r>
+      <w:r>
+        <w:br/>
+        <w:t xml:space="preserve">      </w:t>
+      </w:r>
+      <w:proofErr w:type="spellStart"/>
+      <w:r>
+        <w:t>homeItems</w:t>
+      </w:r>
+      <w:proofErr w:type="spellEnd"/>
+      <w:r>
+        <w:t>: [],</w:t>
+      </w:r>
+      <w:r>
+        <w:br/>
+        <w:t xml:space="preserve">      </w:t>
+      </w:r>
+      <w:proofErr w:type="spellStart"/>
+      <w:r>
+        <w:t>bottomItems</w:t>
+      </w:r>
+      <w:proofErr w:type="spellEnd"/>
+      <w:r>
+        <w:t>: [],</w:t>
+      </w:r>
+      <w:r>
+        <w:br/>
+        <w:t xml:space="preserve">      </w:t>
+      </w:r>
+      <w:proofErr w:type="spellStart"/>
+      <w:r>
+        <w:t>selectedIndex</w:t>
+      </w:r>
+      <w:proofErr w:type="spellEnd"/>
+      <w:r>
+        <w:t>: 0,</w:t>
       </w:r>
       <w:r>
         <w:br/>
@@ -981,19 +1516,75 @@
       </w:r>
       <w:r>
         <w:br/>
-        <w:t xml:space="preserve">  HajjState copyWith({</w:t>
-      </w:r>
-      <w:r>
-        <w:br/>
-        <w:t xml:space="preserve">    List&lt;MenuItemModel&gt;? homeItems,</w:t>
-      </w:r>
-      <w:r>
-        <w:br/>
-        <w:t xml:space="preserve">    List&lt;MenuItemModel&gt;? bottomItems,</w:t>
-      </w:r>
-      <w:r>
-        <w:br/>
-        <w:t xml:space="preserve">    int? selectedIndex,</w:t>
+        <w:t xml:space="preserve">  </w:t>
+      </w:r>
+      <w:proofErr w:type="spellStart"/>
+      <w:r>
+        <w:t>HajjState</w:t>
+      </w:r>
+      <w:proofErr w:type="spellEnd"/>
+      <w:r>
+        <w:t xml:space="preserve"> </w:t>
+      </w:r>
+      <w:proofErr w:type="spellStart"/>
+      <w:r>
+        <w:t>copyWith</w:t>
+      </w:r>
+      <w:proofErr w:type="spellEnd"/>
+      <w:r>
+        <w:t>({</w:t>
+      </w:r>
+      <w:r>
+        <w:br/>
+        <w:t xml:space="preserve">    List&lt;</w:t>
+      </w:r>
+      <w:proofErr w:type="spellStart"/>
+      <w:r>
+        <w:t>MenuItemModel</w:t>
+      </w:r>
+      <w:proofErr w:type="spellEnd"/>
+      <w:r>
+        <w:t xml:space="preserve">&gt;? </w:t>
+      </w:r>
+      <w:proofErr w:type="spellStart"/>
+      <w:r>
+        <w:t>homeItems</w:t>
+      </w:r>
+      <w:proofErr w:type="spellEnd"/>
+      <w:r>
+        <w:t>,</w:t>
+      </w:r>
+      <w:r>
+        <w:br/>
+        <w:t xml:space="preserve">    List&lt;</w:t>
+      </w:r>
+      <w:proofErr w:type="spellStart"/>
+      <w:r>
+        <w:t>MenuItemModel</w:t>
+      </w:r>
+      <w:proofErr w:type="spellEnd"/>
+      <w:r>
+        <w:t xml:space="preserve">&gt;? </w:t>
+      </w:r>
+      <w:proofErr w:type="spellStart"/>
+      <w:r>
+        <w:t>bottomItems</w:t>
+      </w:r>
+      <w:proofErr w:type="spellEnd"/>
+      <w:r>
+        <w:t>,</w:t>
+      </w:r>
+      <w:r>
+        <w:br/>
+        <w:t xml:space="preserve">    int? </w:t>
+      </w:r>
+      <w:proofErr w:type="spellStart"/>
+      <w:r>
+        <w:t>selectedIndex</w:t>
+      </w:r>
+      <w:proofErr w:type="spellEnd"/>
+      <w:r>
+        <w:t>,</w:t>
       </w:r>
       <w:r>
         <w:br/>
@@ -1001,19 +1592,99 @@
       </w:r>
       <w:r>
         <w:br/>
-        <w:t xml:space="preserve">    return HajjState(</w:t>
-      </w:r>
-      <w:r>
-        <w:br/>
-        <w:t xml:space="preserve">      homeItems: homeItems ?? this.homeItems,</w:t>
-      </w:r>
-      <w:r>
-        <w:br/>
-        <w:t xml:space="preserve">      bottomItems: bottomItems ?? this.bottomItems,</w:t>
-      </w:r>
-      <w:r>
-        <w:br/>
-        <w:t xml:space="preserve">      selectedIndex: selectedIndex ?? this.selectedIndex,</w:t>
+        <w:t xml:space="preserve">    return </w:t>
+      </w:r>
+      <w:proofErr w:type="spellStart"/>
+      <w:r>
+        <w:t>HajjState</w:t>
+      </w:r>
+      <w:proofErr w:type="spellEnd"/>
+      <w:r>
+        <w:t>(</w:t>
+      </w:r>
+      <w:r>
+        <w:br/>
+        <w:t xml:space="preserve">      </w:t>
+      </w:r>
+      <w:proofErr w:type="spellStart"/>
+      <w:r>
+        <w:t>homeItems</w:t>
+      </w:r>
+      <w:proofErr w:type="spellEnd"/>
+      <w:r>
+        <w:t xml:space="preserve">: </w:t>
+      </w:r>
+      <w:proofErr w:type="spellStart"/>
+      <w:r>
+        <w:t>homeItems</w:t>
+      </w:r>
+      <w:proofErr w:type="spellEnd"/>
+      <w:r>
+        <w:t xml:space="preserve"> ?? </w:t>
+      </w:r>
+      <w:proofErr w:type="spellStart"/>
+      <w:r>
+        <w:t>this.homeItems</w:t>
+      </w:r>
+      <w:proofErr w:type="spellEnd"/>
+      <w:r>
+        <w:t>,</w:t>
+      </w:r>
+      <w:r>
+        <w:br/>
+        <w:t xml:space="preserve">      </w:t>
+      </w:r>
+      <w:proofErr w:type="spellStart"/>
+      <w:r>
+        <w:t>bottomItems</w:t>
+      </w:r>
+      <w:proofErr w:type="spellEnd"/>
+      <w:r>
+        <w:t xml:space="preserve">: </w:t>
+      </w:r>
+      <w:proofErr w:type="spellStart"/>
+      <w:r>
+        <w:t>bottomItems</w:t>
+      </w:r>
+      <w:proofErr w:type="spellEnd"/>
+      <w:r>
+        <w:t xml:space="preserve"> ?? </w:t>
+      </w:r>
+      <w:proofErr w:type="spellStart"/>
+      <w:r>
+        <w:t>this.bottomItems</w:t>
+      </w:r>
+      <w:proofErr w:type="spellEnd"/>
+      <w:r>
+        <w:t>,</w:t>
+      </w:r>
+      <w:r>
+        <w:br/>
+        <w:t xml:space="preserve">      </w:t>
+      </w:r>
+      <w:proofErr w:type="spellStart"/>
+      <w:r>
+        <w:t>selectedIndex</w:t>
+      </w:r>
+      <w:proofErr w:type="spellEnd"/>
+      <w:r>
+        <w:t xml:space="preserve">: </w:t>
+      </w:r>
+      <w:proofErr w:type="spellStart"/>
+      <w:r>
+        <w:t>selectedIndex</w:t>
+      </w:r>
+      <w:proofErr w:type="spellEnd"/>
+      <w:r>
+        <w:t xml:space="preserve"> ?? </w:t>
+      </w:r>
+      <w:proofErr w:type="spellStart"/>
+      <w:r>
+        <w:t>this.selectedIndex</w:t>
+      </w:r>
+      <w:proofErr w:type="spellEnd"/>
+      <w:r>
+        <w:t>,</w:t>
       </w:r>
       <w:r>
         <w:br/>
@@ -1055,8 +1726,26 @@
           <w:b/>
           <w:bCs/>
         </w:rPr>
-        <w:t xml:space="preserve"> hajj_cubit.dart</w:t>
-      </w:r>
+        <w:t xml:space="preserve"> </w:t>
+      </w:r>
+      <w:proofErr w:type="spellStart"/>
+      <w:r>
+        <w:rPr>
+          <w:b/>
+          <w:bCs/>
+        </w:rPr>
+        <w:t>hajj_</w:t>
+      </w:r>
+      <w:proofErr w:type="gramStart"/>
+      <w:r>
+        <w:rPr>
+          <w:b/>
+          <w:bCs/>
+        </w:rPr>
+        <w:t>cubit.dart</w:t>
+      </w:r>
+      <w:proofErr w:type="spellEnd"/>
+      <w:proofErr w:type="gramEnd"/>
     </w:p>
     <w:p>
       <w:pPr>
@@ -1083,15 +1772,37 @@
         <w:rPr>
           <w:rFonts w:ascii="Segoe UI Emoji" w:hAnsi="Segoe UI Emoji" w:cs="Segoe UI Emoji"/>
         </w:rPr>
+        <w:lastRenderedPageBreak/>
         <w:t>📍</w:t>
       </w:r>
       <w:r>
-        <w:t xml:space="preserve"> presentation/cubit/hajj/hajj_cubit.dart</w:t>
-      </w:r>
-    </w:p>
-    <w:p>
-      <w:r>
-        <w:t>import 'package:flutter_bloc/flutter_bloc.dart';</w:t>
+        <w:t xml:space="preserve"> presentation/cubit/hajj/</w:t>
+      </w:r>
+      <w:proofErr w:type="spellStart"/>
+      <w:r>
+        <w:t>hajj_cubit.dart</w:t>
+      </w:r>
+      <w:proofErr w:type="spellEnd"/>
+    </w:p>
+    <w:p>
+      <w:r>
+        <w:t>import '</w:t>
+      </w:r>
+      <w:proofErr w:type="spellStart"/>
+      <w:r>
+        <w:t>package:flutter_bloc</w:t>
+      </w:r>
+      <w:proofErr w:type="spellEnd"/>
+      <w:r>
+        <w:t>/</w:t>
+      </w:r>
+      <w:proofErr w:type="spellStart"/>
+      <w:r>
+        <w:t>flutter_bloc.dart</w:t>
+      </w:r>
+      <w:proofErr w:type="spellEnd"/>
+      <w:r>
+        <w:t>';</w:t>
       </w:r>
       <w:r>
         <w:br/>
@@ -1105,25 +1816,77 @@
       </w:r>
       <w:r>
         <w:br/>
-        <w:t>import 'hajj_state.dart';</w:t>
-      </w:r>
-      <w:r>
-        <w:br/>
-      </w:r>
-      <w:r>
-        <w:br/>
-      </w:r>
-      <w:r>
-        <w:lastRenderedPageBreak/>
-        <w:t>class HajjCubit extends Cubit&lt;HajjState&gt; {</w:t>
-      </w:r>
-      <w:r>
-        <w:br/>
-        <w:t xml:space="preserve">  HajjCubit() : super(HajjState.initial()) {</w:t>
-      </w:r>
-      <w:r>
-        <w:br/>
-        <w:t xml:space="preserve">    loadMenus();</w:t>
+      </w:r>
+      <w:proofErr w:type="spellStart"/>
+      <w:r>
+        <w:t>import</w:t>
+      </w:r>
+      <w:proofErr w:type="spellEnd"/>
+      <w:r>
+        <w:t xml:space="preserve"> '</w:t>
+      </w:r>
+      <w:proofErr w:type="spellStart"/>
+      <w:r>
+        <w:t>hajj_state.dart</w:t>
+      </w:r>
+      <w:proofErr w:type="spellEnd"/>
+      <w:r>
+        <w:t>';</w:t>
+      </w:r>
+      <w:r>
+        <w:br/>
+      </w:r>
+      <w:r>
+        <w:br/>
+        <w:t xml:space="preserve">class </w:t>
+      </w:r>
+      <w:proofErr w:type="spellStart"/>
+      <w:r>
+        <w:t>HajjCubit</w:t>
+      </w:r>
+      <w:proofErr w:type="spellEnd"/>
+      <w:r>
+        <w:t xml:space="preserve"> extends Cubit&lt;</w:t>
+      </w:r>
+      <w:proofErr w:type="spellStart"/>
+      <w:r>
+        <w:t>HajjState</w:t>
+      </w:r>
+      <w:proofErr w:type="spellEnd"/>
+      <w:r>
+        <w:t>&gt; {</w:t>
+      </w:r>
+      <w:r>
+        <w:br/>
+        <w:t xml:space="preserve">  </w:t>
+      </w:r>
+      <w:proofErr w:type="spellStart"/>
+      <w:r>
+        <w:t>HajjCubit</w:t>
+      </w:r>
+      <w:proofErr w:type="spellEnd"/>
+      <w:r>
+        <w:t>() : super(</w:t>
+      </w:r>
+      <w:proofErr w:type="spellStart"/>
+      <w:r>
+        <w:t>HajjState.initial</w:t>
+      </w:r>
+      <w:proofErr w:type="spellEnd"/>
+      <w:r>
+        <w:t>()) {</w:t>
+      </w:r>
+      <w:r>
+        <w:br/>
+        <w:t xml:space="preserve">    </w:t>
+      </w:r>
+      <w:proofErr w:type="spellStart"/>
+      <w:r>
+        <w:t>loadMenus</w:t>
+      </w:r>
+      <w:proofErr w:type="spellEnd"/>
+      <w:r>
+        <w:t>();</w:t>
       </w:r>
       <w:r>
         <w:br/>
@@ -1134,7 +1897,15 @@
       </w:r>
       <w:r>
         <w:br/>
-        <w:t xml:space="preserve">  void loadMenus() {</w:t>
+        <w:t xml:space="preserve">  void </w:t>
+      </w:r>
+      <w:proofErr w:type="spellStart"/>
+      <w:r>
+        <w:t>loadMenus</w:t>
+      </w:r>
+      <w:proofErr w:type="spellEnd"/>
+      <w:r>
+        <w:t>() {</w:t>
       </w:r>
       <w:r>
         <w:br/>
@@ -1142,15 +1913,55 @@
       </w:r>
       <w:r>
         <w:br/>
-        <w:t xml:space="preserve">      state.copyWith(</w:t>
-      </w:r>
-      <w:r>
-        <w:br/>
-        <w:t xml:space="preserve">        homeItems: MenuData.homeMenu,</w:t>
-      </w:r>
-      <w:r>
-        <w:br/>
-        <w:t xml:space="preserve">        bottomItems: MenuData.bottomMenu,</w:t>
+        <w:t xml:space="preserve">      </w:t>
+      </w:r>
+      <w:proofErr w:type="spellStart"/>
+      <w:r>
+        <w:t>state.copyWith</w:t>
+      </w:r>
+      <w:proofErr w:type="spellEnd"/>
+      <w:r>
+        <w:t>(</w:t>
+      </w:r>
+      <w:r>
+        <w:br/>
+        <w:t xml:space="preserve">        </w:t>
+      </w:r>
+      <w:proofErr w:type="spellStart"/>
+      <w:r>
+        <w:t>homeItems</w:t>
+      </w:r>
+      <w:proofErr w:type="spellEnd"/>
+      <w:r>
+        <w:t xml:space="preserve">: </w:t>
+      </w:r>
+      <w:proofErr w:type="spellStart"/>
+      <w:r>
+        <w:t>MenuData.homeMenu</w:t>
+      </w:r>
+      <w:proofErr w:type="spellEnd"/>
+      <w:r>
+        <w:t>,</w:t>
+      </w:r>
+      <w:r>
+        <w:br/>
+        <w:t xml:space="preserve">        </w:t>
+      </w:r>
+      <w:proofErr w:type="spellStart"/>
+      <w:r>
+        <w:t>bottomItems</w:t>
+      </w:r>
+      <w:proofErr w:type="spellEnd"/>
+      <w:r>
+        <w:t xml:space="preserve">: </w:t>
+      </w:r>
+      <w:proofErr w:type="spellStart"/>
+      <w:r>
+        <w:t>MenuData.bottomMenu</w:t>
+      </w:r>
+      <w:proofErr w:type="spellEnd"/>
+      <w:r>
+        <w:t>,</w:t>
       </w:r>
       <w:r>
         <w:br/>
@@ -1169,11 +1980,35 @@
       </w:r>
       <w:r>
         <w:br/>
-        <w:t xml:space="preserve">  void changeBottomIndex(int index) {</w:t>
-      </w:r>
-      <w:r>
-        <w:br/>
-        <w:t xml:space="preserve">    emit(state.copyWith(selectedIndex: index));</w:t>
+        <w:t xml:space="preserve">  void </w:t>
+      </w:r>
+      <w:proofErr w:type="spellStart"/>
+      <w:r>
+        <w:t>changeBottomIndex</w:t>
+      </w:r>
+      <w:proofErr w:type="spellEnd"/>
+      <w:r>
+        <w:t>(int index) {</w:t>
+      </w:r>
+      <w:r>
+        <w:br/>
+        <w:t xml:space="preserve">    emit(</w:t>
+      </w:r>
+      <w:proofErr w:type="spellStart"/>
+      <w:r>
+        <w:t>state.copyWith</w:t>
+      </w:r>
+      <w:proofErr w:type="spellEnd"/>
+      <w:r>
+        <w:t>(</w:t>
+      </w:r>
+      <w:proofErr w:type="spellStart"/>
+      <w:r>
+        <w:t>selectedIndex</w:t>
+      </w:r>
+      <w:proofErr w:type="spellEnd"/>
+      <w:r>
+        <w:t>: index));</w:t>
       </w:r>
       <w:r>
         <w:br/>
@@ -1211,8 +2046,26 @@
           <w:b/>
           <w:bCs/>
         </w:rPr>
-        <w:t xml:space="preserve"> home_screen.dart</w:t>
-      </w:r>
+        <w:t xml:space="preserve"> </w:t>
+      </w:r>
+      <w:proofErr w:type="spellStart"/>
+      <w:r>
+        <w:rPr>
+          <w:b/>
+          <w:bCs/>
+        </w:rPr>
+        <w:t>home_</w:t>
+      </w:r>
+      <w:proofErr w:type="gramStart"/>
+      <w:r>
+        <w:rPr>
+          <w:b/>
+          <w:bCs/>
+        </w:rPr>
+        <w:t>screen.dart</w:t>
+      </w:r>
+      <w:proofErr w:type="spellEnd"/>
+      <w:proofErr w:type="gramEnd"/>
     </w:p>
     <w:p>
       <w:pPr>
@@ -1242,38 +2095,126 @@
         <w:t>📍</w:t>
       </w:r>
       <w:r>
-        <w:t xml:space="preserve"> presentation/pages/home/home_screen.dart</w:t>
-      </w:r>
-    </w:p>
-    <w:p>
-      <w:r>
-        <w:t>import 'package:flutter/material.dart';</w:t>
-      </w:r>
-      <w:r>
-        <w:br/>
-        <w:t>import 'package:flutter_bloc/flutter_bloc.dart';</w:t>
-      </w:r>
-      <w:r>
-        <w:br/>
-      </w:r>
-      <w:r>
-        <w:br/>
-        <w:t>import '../../cubit/hajj/hajj_cubit.dart';</w:t>
-      </w:r>
-      <w:r>
-        <w:br/>
-        <w:t>import '../../cubit/hajj/hajj_state.dart';</w:t>
-      </w:r>
-      <w:r>
-        <w:br/>
-      </w:r>
-      <w:r>
-        <w:br/>
-        <w:t>class HomeScreen extends StatelessWidget {</w:t>
-      </w:r>
-      <w:r>
-        <w:br/>
-        <w:t xml:space="preserve">  const HomeScreen({super.key});</w:t>
+        <w:t xml:space="preserve"> presentation/pages/home/</w:t>
+      </w:r>
+      <w:proofErr w:type="spellStart"/>
+      <w:r>
+        <w:t>home_screen.dart</w:t>
+      </w:r>
+      <w:proofErr w:type="spellEnd"/>
+    </w:p>
+    <w:p>
+      <w:r>
+        <w:t>import '</w:t>
+      </w:r>
+      <w:proofErr w:type="spellStart"/>
+      <w:r>
+        <w:t>package:flutter</w:t>
+      </w:r>
+      <w:proofErr w:type="spellEnd"/>
+      <w:r>
+        <w:t>/</w:t>
+      </w:r>
+      <w:proofErr w:type="spellStart"/>
+      <w:r>
+        <w:t>material.dart</w:t>
+      </w:r>
+      <w:proofErr w:type="spellEnd"/>
+      <w:r>
+        <w:t>';</w:t>
+      </w:r>
+      <w:r>
+        <w:br/>
+        <w:t>import '</w:t>
+      </w:r>
+      <w:proofErr w:type="spellStart"/>
+      <w:r>
+        <w:t>package:flutter_bloc</w:t>
+      </w:r>
+      <w:proofErr w:type="spellEnd"/>
+      <w:r>
+        <w:t>/</w:t>
+      </w:r>
+      <w:proofErr w:type="spellStart"/>
+      <w:r>
+        <w:t>flutter_bloc.dart</w:t>
+      </w:r>
+      <w:proofErr w:type="spellEnd"/>
+      <w:r>
+        <w:t>';</w:t>
+      </w:r>
+      <w:r>
+        <w:br/>
+      </w:r>
+      <w:r>
+        <w:br/>
+        <w:t>import '../../cubit/hajj/</w:t>
+      </w:r>
+      <w:proofErr w:type="spellStart"/>
+      <w:r>
+        <w:t>hajj_cubit.dart</w:t>
+      </w:r>
+      <w:proofErr w:type="spellEnd"/>
+      <w:r>
+        <w:t>';</w:t>
+      </w:r>
+      <w:r>
+        <w:br/>
+      </w:r>
+      <w:r>
+        <w:lastRenderedPageBreak/>
+        <w:t>import '../../cubit/hajj/</w:t>
+      </w:r>
+      <w:proofErr w:type="spellStart"/>
+      <w:r>
+        <w:t>hajj_state.dart</w:t>
+      </w:r>
+      <w:proofErr w:type="spellEnd"/>
+      <w:r>
+        <w:t>';</w:t>
+      </w:r>
+      <w:r>
+        <w:br/>
+      </w:r>
+      <w:r>
+        <w:br/>
+        <w:t xml:space="preserve">class </w:t>
+      </w:r>
+      <w:proofErr w:type="spellStart"/>
+      <w:r>
+        <w:t>HomeScreen</w:t>
+      </w:r>
+      <w:proofErr w:type="spellEnd"/>
+      <w:r>
+        <w:t xml:space="preserve"> extends </w:t>
+      </w:r>
+      <w:proofErr w:type="spellStart"/>
+      <w:r>
+        <w:t>StatelessWidget</w:t>
+      </w:r>
+      <w:proofErr w:type="spellEnd"/>
+      <w:r>
+        <w:t xml:space="preserve"> {</w:t>
+      </w:r>
+      <w:r>
+        <w:br/>
+        <w:t xml:space="preserve">  const </w:t>
+      </w:r>
+      <w:proofErr w:type="spellStart"/>
+      <w:r>
+        <w:t>HomeScreen</w:t>
+      </w:r>
+      <w:proofErr w:type="spellEnd"/>
+      <w:r>
+        <w:t>({</w:t>
+      </w:r>
+      <w:proofErr w:type="spellStart"/>
+      <w:r>
+        <w:t>super.key</w:t>
+      </w:r>
+      <w:proofErr w:type="spellEnd"/>
+      <w:r>
+        <w:t>});</w:t>
       </w:r>
       <w:r>
         <w:br/>
@@ -1284,96 +2225,405 @@
       </w:r>
       <w:r>
         <w:br/>
-        <w:t xml:space="preserve">  Widget build(BuildContext context) {</w:t>
-      </w:r>
-      <w:r>
-        <w:br/>
-        <w:t xml:space="preserve">    return BlocBuilder&lt;HajjCubit, HajjState&gt;(</w:t>
+        <w:t xml:space="preserve">  Widget build(</w:t>
+      </w:r>
+      <w:proofErr w:type="spellStart"/>
+      <w:r>
+        <w:t>BuildContext</w:t>
+      </w:r>
+      <w:proofErr w:type="spellEnd"/>
+      <w:r>
+        <w:t xml:space="preserve"> context) {</w:t>
+      </w:r>
+      <w:r>
+        <w:br/>
+        <w:t xml:space="preserve">    return </w:t>
+      </w:r>
+      <w:proofErr w:type="spellStart"/>
+      <w:r>
+        <w:t>BlocBuilder</w:t>
+      </w:r>
+      <w:proofErr w:type="spellEnd"/>
+      <w:r>
+        <w:t>&lt;</w:t>
+      </w:r>
+      <w:proofErr w:type="spellStart"/>
+      <w:r>
+        <w:t>HajjCubit</w:t>
+      </w:r>
+      <w:proofErr w:type="spellEnd"/>
+      <w:r>
+        <w:t xml:space="preserve">, </w:t>
+      </w:r>
+      <w:proofErr w:type="spellStart"/>
+      <w:r>
+        <w:t>HajjState</w:t>
+      </w:r>
+      <w:proofErr w:type="spellEnd"/>
+      <w:r>
+        <w:t>&gt;(</w:t>
+      </w:r>
+      <w:r>
+        <w:br/>
+        <w:t xml:space="preserve">      builder: (context, state) {</w:t>
+      </w:r>
+      <w:r>
+        <w:br/>
+        <w:t xml:space="preserve">        return Scaffold(</w:t>
+      </w:r>
+      <w:r>
+        <w:br/>
+        <w:t xml:space="preserve">          </w:t>
+      </w:r>
+      <w:proofErr w:type="spellStart"/>
+      <w:r>
+        <w:t>appBar</w:t>
+      </w:r>
+      <w:proofErr w:type="spellEnd"/>
+      <w:r>
+        <w:t xml:space="preserve">: </w:t>
+      </w:r>
+      <w:proofErr w:type="spellStart"/>
+      <w:r>
+        <w:t>AppBar</w:t>
+      </w:r>
+      <w:proofErr w:type="spellEnd"/>
+      <w:r>
+        <w:t>(</w:t>
+      </w:r>
+      <w:r>
+        <w:br/>
+        <w:t xml:space="preserve">            title: const Text("Hajj App"),</w:t>
+      </w:r>
+      <w:r>
+        <w:br/>
+        <w:t xml:space="preserve">          ),</w:t>
+      </w:r>
+      <w:r>
+        <w:br/>
+      </w:r>
+      <w:r>
+        <w:br/>
+        <w:t xml:space="preserve">          // HOME LIST</w:t>
+      </w:r>
+      <w:r>
+        <w:br/>
+        <w:t xml:space="preserve">          body: </w:t>
+      </w:r>
+      <w:proofErr w:type="spellStart"/>
+      <w:r>
+        <w:t>ListView.builder</w:t>
+      </w:r>
+      <w:proofErr w:type="spellEnd"/>
+      <w:r>
+        <w:t>(</w:t>
+      </w:r>
+      <w:r>
+        <w:br/>
+        <w:t xml:space="preserve">            </w:t>
+      </w:r>
+      <w:proofErr w:type="spellStart"/>
+      <w:r>
+        <w:t>itemCount</w:t>
+      </w:r>
+      <w:proofErr w:type="spellEnd"/>
+      <w:r>
+        <w:t xml:space="preserve">: </w:t>
+      </w:r>
+      <w:proofErr w:type="spellStart"/>
+      <w:r>
+        <w:t>state.homeItems.length</w:t>
+      </w:r>
+      <w:proofErr w:type="spellEnd"/>
+      <w:r>
+        <w:t>,</w:t>
+      </w:r>
+      <w:r>
+        <w:br/>
+        <w:t xml:space="preserve">            </w:t>
+      </w:r>
+      <w:proofErr w:type="spellStart"/>
+      <w:r>
+        <w:t>itemBuilder</w:t>
+      </w:r>
+      <w:proofErr w:type="spellEnd"/>
+      <w:r>
+        <w:t>: (context, index) {</w:t>
+      </w:r>
+      <w:r>
+        <w:br/>
+        <w:t xml:space="preserve">              final item = </w:t>
+      </w:r>
+      <w:proofErr w:type="spellStart"/>
+      <w:r>
+        <w:t>state.homeItems</w:t>
+      </w:r>
+      <w:proofErr w:type="spellEnd"/>
+      <w:r>
+        <w:t>[index];</w:t>
+      </w:r>
+      <w:r>
+        <w:br/>
+      </w:r>
+      <w:r>
+        <w:br/>
+        <w:t xml:space="preserve">              return Card(</w:t>
+      </w:r>
+      <w:r>
+        <w:br/>
+        <w:t xml:space="preserve">                margin: const </w:t>
+      </w:r>
+      <w:proofErr w:type="spellStart"/>
+      <w:r>
+        <w:t>EdgeInsets.all</w:t>
+      </w:r>
+      <w:proofErr w:type="spellEnd"/>
+      <w:r>
+        <w:t>(10),</w:t>
+      </w:r>
+      <w:r>
+        <w:br/>
+        <w:t xml:space="preserve">                child: </w:t>
+      </w:r>
+      <w:proofErr w:type="spellStart"/>
+      <w:r>
+        <w:t>ListTile</w:t>
+      </w:r>
+      <w:proofErr w:type="spellEnd"/>
+      <w:r>
+        <w:t>(</w:t>
+      </w:r>
+      <w:r>
+        <w:br/>
+        <w:t xml:space="preserve">                  leading: Text(</w:t>
+      </w:r>
+      <w:r>
+        <w:br/>
+        <w:t xml:space="preserve">                    </w:t>
+      </w:r>
+      <w:proofErr w:type="spellStart"/>
+      <w:r>
+        <w:t>item.icon</w:t>
+      </w:r>
+      <w:proofErr w:type="spellEnd"/>
+      <w:r>
+        <w:t>,</w:t>
+      </w:r>
+      <w:r>
+        <w:br/>
+        <w:t xml:space="preserve">                    style: const </w:t>
+      </w:r>
+      <w:proofErr w:type="spellStart"/>
+      <w:r>
+        <w:t>TextStyle</w:t>
+      </w:r>
+      <w:proofErr w:type="spellEnd"/>
+      <w:r>
+        <w:t>(</w:t>
+      </w:r>
+      <w:proofErr w:type="spellStart"/>
+      <w:r>
+        <w:t>fontSize</w:t>
+      </w:r>
+      <w:proofErr w:type="spellEnd"/>
+      <w:r>
+        <w:t>: 24),</w:t>
+      </w:r>
+      <w:r>
+        <w:br/>
+        <w:t xml:space="preserve">                  ),</w:t>
+      </w:r>
+      <w:r>
+        <w:br/>
+        <w:t xml:space="preserve">                  title: Text(</w:t>
+      </w:r>
+      <w:proofErr w:type="spellStart"/>
+      <w:r>
+        <w:t>item.title</w:t>
+      </w:r>
+      <w:proofErr w:type="spellEnd"/>
+      <w:r>
+        <w:t>),</w:t>
+      </w:r>
+      <w:r>
+        <w:br/>
+        <w:t xml:space="preserve">                ),</w:t>
+      </w:r>
+      <w:r>
+        <w:br/>
+        <w:t xml:space="preserve">              );</w:t>
+      </w:r>
+      <w:r>
+        <w:br/>
+        <w:t xml:space="preserve">            },</w:t>
+      </w:r>
+      <w:r>
+        <w:br/>
+        <w:t xml:space="preserve">          ),</w:t>
+      </w:r>
+      <w:r>
+        <w:br/>
+      </w:r>
+      <w:r>
+        <w:br/>
+        <w:t xml:space="preserve">          // BOTTOM BAR</w:t>
+      </w:r>
+      <w:r>
+        <w:br/>
+        <w:t xml:space="preserve">          </w:t>
+      </w:r>
+      <w:proofErr w:type="spellStart"/>
+      <w:r>
+        <w:t>bottomNavigationBar</w:t>
+      </w:r>
+      <w:proofErr w:type="spellEnd"/>
+      <w:r>
+        <w:t xml:space="preserve">: </w:t>
+      </w:r>
+      <w:proofErr w:type="spellStart"/>
+      <w:r>
+        <w:t>BottomNavigationBar</w:t>
+      </w:r>
+      <w:proofErr w:type="spellEnd"/>
+      <w:r>
+        <w:t>(</w:t>
+      </w:r>
+      <w:r>
+        <w:br/>
+        <w:t xml:space="preserve">            type: </w:t>
+      </w:r>
+      <w:proofErr w:type="spellStart"/>
+      <w:r>
+        <w:t>BottomNavigationBarType.fixed</w:t>
+      </w:r>
+      <w:proofErr w:type="spellEnd"/>
+      <w:r>
+        <w:t>,</w:t>
+      </w:r>
+      <w:r>
+        <w:br/>
+        <w:t xml:space="preserve">            </w:t>
+      </w:r>
+      <w:proofErr w:type="spellStart"/>
+      <w:r>
+        <w:t>currentIndex</w:t>
+      </w:r>
+      <w:proofErr w:type="spellEnd"/>
+      <w:r>
+        <w:t xml:space="preserve">: </w:t>
+      </w:r>
+      <w:proofErr w:type="spellStart"/>
+      <w:r>
+        <w:t>state.selectedIndex</w:t>
+      </w:r>
+      <w:proofErr w:type="spellEnd"/>
+      <w:r>
+        <w:t>,</w:t>
+      </w:r>
+      <w:r>
+        <w:br/>
       </w:r>
       <w:r>
         <w:br/>
       </w:r>
       <w:r>
         <w:lastRenderedPageBreak/>
-        <w:t xml:space="preserve">      builder: (context, state) {</w:t>
-      </w:r>
-      <w:r>
-        <w:br/>
-        <w:t xml:space="preserve">        return Scaffold(</w:t>
-      </w:r>
-      <w:r>
-        <w:br/>
-        <w:t xml:space="preserve">          appBar: AppBar(</w:t>
-      </w:r>
-      <w:r>
-        <w:br/>
-        <w:t xml:space="preserve">            title: const Text("Hajj App"),</w:t>
-      </w:r>
-      <w:r>
-        <w:br/>
-        <w:t xml:space="preserve">          ),</w:t>
-      </w:r>
-      <w:r>
-        <w:br/>
-      </w:r>
-      <w:r>
-        <w:br/>
-        <w:t xml:space="preserve">          // HOME LIST</w:t>
-      </w:r>
-      <w:r>
-        <w:br/>
-        <w:t xml:space="preserve">          body: ListView.builder(</w:t>
-      </w:r>
-      <w:r>
-        <w:br/>
-        <w:t xml:space="preserve">            itemCount: state.homeItems.length,</w:t>
-      </w:r>
-      <w:r>
-        <w:br/>
-        <w:t xml:space="preserve">            itemBuilder: (context, index) {</w:t>
-      </w:r>
-      <w:r>
-        <w:br/>
-        <w:t xml:space="preserve">              final item = state.homeItems[index];</w:t>
-      </w:r>
-      <w:r>
-        <w:br/>
-      </w:r>
-      <w:r>
-        <w:br/>
-        <w:t xml:space="preserve">              return Card(</w:t>
-      </w:r>
-      <w:r>
-        <w:br/>
-        <w:t xml:space="preserve">                margin: const EdgeInsets.all(10),</w:t>
-      </w:r>
-      <w:r>
-        <w:br/>
-        <w:t xml:space="preserve">                child: ListTile(</w:t>
-      </w:r>
-      <w:r>
-        <w:br/>
-        <w:t xml:space="preserve">                  leading: Text(</w:t>
-      </w:r>
-      <w:r>
-        <w:br/>
-        <w:t xml:space="preserve">                    item.icon,</w:t>
-      </w:r>
-      <w:r>
-        <w:br/>
-        <w:t xml:space="preserve">                    style: const TextStyle(fontSize: 24),</w:t>
-      </w:r>
-      <w:r>
-        <w:br/>
-        <w:t xml:space="preserve">                  ),</w:t>
-      </w:r>
-      <w:r>
-        <w:br/>
-        <w:t xml:space="preserve">                  title: Text(item.title),</w:t>
-      </w:r>
-      <w:r>
-        <w:br/>
-        <w:t xml:space="preserve">                ),</w:t>
+        <w:t xml:space="preserve">            </w:t>
+      </w:r>
+      <w:proofErr w:type="spellStart"/>
+      <w:r>
+        <w:t>onTap</w:t>
+      </w:r>
+      <w:proofErr w:type="spellEnd"/>
+      <w:r>
+        <w:t>: (index) {</w:t>
+      </w:r>
+      <w:r>
+        <w:br/>
+        <w:t xml:space="preserve">              </w:t>
+      </w:r>
+      <w:proofErr w:type="spellStart"/>
+      <w:r>
+        <w:t>context.read</w:t>
+      </w:r>
+      <w:proofErr w:type="spellEnd"/>
+      <w:r>
+        <w:t>&lt;</w:t>
+      </w:r>
+      <w:proofErr w:type="spellStart"/>
+      <w:r>
+        <w:t>HajjCubit</w:t>
+      </w:r>
+      <w:proofErr w:type="spellEnd"/>
+      <w:r>
+        <w:t>&gt;()</w:t>
+      </w:r>
+      <w:r>
+        <w:br/>
+        <w:t xml:space="preserve">                  .</w:t>
+      </w:r>
+      <w:proofErr w:type="spellStart"/>
+      <w:r>
+        <w:t>changeBottomIndex</w:t>
+      </w:r>
+      <w:proofErr w:type="spellEnd"/>
+      <w:r>
+        <w:t>(index);</w:t>
+      </w:r>
+      <w:r>
+        <w:br/>
+        <w:t xml:space="preserve">            },</w:t>
+      </w:r>
+      <w:r>
+        <w:br/>
+      </w:r>
+      <w:r>
+        <w:br/>
+        <w:t xml:space="preserve">            items: </w:t>
+      </w:r>
+      <w:proofErr w:type="spellStart"/>
+      <w:r>
+        <w:t>state.bottomItems.map</w:t>
+      </w:r>
+      <w:proofErr w:type="spellEnd"/>
+      <w:r>
+        <w:t>((item) {</w:t>
+      </w:r>
+      <w:r>
+        <w:br/>
+        <w:t xml:space="preserve">              return </w:t>
+      </w:r>
+      <w:proofErr w:type="spellStart"/>
+      <w:r>
+        <w:t>BottomNavigationBarItem</w:t>
+      </w:r>
+      <w:proofErr w:type="spellEnd"/>
+      <w:r>
+        <w:t>(</w:t>
+      </w:r>
+      <w:r>
+        <w:br/>
+        <w:t xml:space="preserve">                icon: Text(</w:t>
+      </w:r>
+      <w:proofErr w:type="spellStart"/>
+      <w:r>
+        <w:t>item.icon</w:t>
+      </w:r>
+      <w:proofErr w:type="spellEnd"/>
+      <w:r>
+        <w:t>),</w:t>
+      </w:r>
+      <w:r>
+        <w:br/>
+        <w:t xml:space="preserve">                label: </w:t>
+      </w:r>
+      <w:proofErr w:type="spellStart"/>
+      <w:r>
+        <w:t>item.title</w:t>
+      </w:r>
+      <w:proofErr w:type="spellEnd"/>
+      <w:r>
+        <w:t>,</w:t>
       </w:r>
       <w:r>
         <w:br/>
@@ -1381,79 +2631,15 @@
       </w:r>
       <w:r>
         <w:br/>
-        <w:t xml:space="preserve">            },</w:t>
-      </w:r>
-      <w:r>
-        <w:br/>
-        <w:t xml:space="preserve">          ),</w:t>
-      </w:r>
-      <w:r>
-        <w:br/>
-      </w:r>
-      <w:r>
-        <w:br/>
-        <w:t xml:space="preserve">          // BOTTOM BAR</w:t>
-      </w:r>
-      <w:r>
-        <w:br/>
-        <w:t xml:space="preserve">          bottomNavigationBar: BottomNavigationBar(</w:t>
-      </w:r>
-      <w:r>
-        <w:br/>
-        <w:t xml:space="preserve">            type: BottomNavigationBarType.fixed,</w:t>
-      </w:r>
-      <w:r>
-        <w:br/>
-        <w:t xml:space="preserve">            currentIndex: state.selectedIndex,</w:t>
-      </w:r>
-      <w:r>
-        <w:br/>
-      </w:r>
-      <w:r>
-        <w:br/>
-        <w:t xml:space="preserve">            onTap: (index) {</w:t>
-      </w:r>
-      <w:r>
-        <w:br/>
-        <w:t xml:space="preserve">              context.read&lt;HajjCubit&gt;()</w:t>
-      </w:r>
-      <w:r>
-        <w:br/>
-        <w:t xml:space="preserve">                  .changeBottomIndex(index);</w:t>
-      </w:r>
-      <w:r>
-        <w:br/>
-        <w:t xml:space="preserve">            },</w:t>
-      </w:r>
-      <w:r>
-        <w:br/>
-      </w:r>
-      <w:r>
-        <w:br/>
-        <w:t xml:space="preserve">            items: state.bottomItems.map((item) {</w:t>
-      </w:r>
-      <w:r>
-        <w:br/>
-        <w:t xml:space="preserve">              return BottomNavigationBarItem(</w:t>
-      </w:r>
-      <w:r>
-        <w:br/>
-        <w:t xml:space="preserve">                icon: Text(item.icon),</w:t>
-      </w:r>
-      <w:r>
-        <w:br/>
-      </w:r>
-      <w:r>
-        <w:lastRenderedPageBreak/>
-        <w:t xml:space="preserve">                label: item.title,</w:t>
-      </w:r>
-      <w:r>
-        <w:br/>
-        <w:t xml:space="preserve">              );</w:t>
-      </w:r>
-      <w:r>
-        <w:br/>
-        <w:t xml:space="preserve">            }).toList(),</w:t>
+        <w:t xml:space="preserve">            }).</w:t>
+      </w:r>
+      <w:proofErr w:type="spellStart"/>
+      <w:r>
+        <w:t>toList</w:t>
+      </w:r>
+      <w:proofErr w:type="spellEnd"/>
+      <w:r>
+        <w:t>(),</w:t>
       </w:r>
       <w:r>
         <w:br/>
@@ -1546,9 +2732,13 @@
       </w:r>
     </w:p>
     <w:p>
+      <w:proofErr w:type="spellStart"/>
+      <w:proofErr w:type="gramStart"/>
       <w:r>
         <w:t>main.dart</w:t>
       </w:r>
+      <w:proofErr w:type="spellEnd"/>
+      <w:proofErr w:type="gramEnd"/>
     </w:p>
     <w:p>
       <w:r>
@@ -1586,12 +2776,32 @@
       </w:r>
     </w:p>
     <w:p>
-      <w:r>
-        <w:t>BlocProvider(</w:t>
-      </w:r>
-      <w:r>
-        <w:br/>
-        <w:t xml:space="preserve">  create: (_) =&gt; HajjCubit(),</w:t>
+      <w:proofErr w:type="spellStart"/>
+      <w:proofErr w:type="gramStart"/>
+      <w:r>
+        <w:t>BlocProvider</w:t>
+      </w:r>
+      <w:proofErr w:type="spellEnd"/>
+      <w:r>
+        <w:t>(</w:t>
+      </w:r>
+      <w:proofErr w:type="gramEnd"/>
+      <w:r>
+        <w:br/>
+        <w:t xml:space="preserve">  create: (_) =&gt; </w:t>
+      </w:r>
+      <w:proofErr w:type="spellStart"/>
+      <w:proofErr w:type="gramStart"/>
+      <w:r>
+        <w:t>HajjCubit</w:t>
+      </w:r>
+      <w:proofErr w:type="spellEnd"/>
+      <w:r>
+        <w:t>(</w:t>
+      </w:r>
+      <w:proofErr w:type="gramEnd"/>
+      <w:r>
+        <w:t>),</w:t>
       </w:r>
       <w:r>
         <w:br/>
@@ -1630,12 +2840,23 @@
     </w:p>
     <w:p>
       <w:r>
+        <w:lastRenderedPageBreak/>
         <w:t>Cubit loads menu data:</w:t>
       </w:r>
     </w:p>
     <w:p>
-      <w:r>
-        <w:t>loadMenus()</w:t>
+      <w:proofErr w:type="spellStart"/>
+      <w:proofErr w:type="gramStart"/>
+      <w:r>
+        <w:t>loadMenus</w:t>
+      </w:r>
+      <w:proofErr w:type="spellEnd"/>
+      <w:r>
+        <w:t>(</w:t>
+      </w:r>
+      <w:proofErr w:type="gramEnd"/>
+      <w:r>
+        <w:t>)</w:t>
       </w:r>
     </w:p>
     <w:p>
@@ -1675,12 +2896,21 @@
     </w:p>
     <w:p>
       <w:r>
-        <w:t>emit(state.copyWith(...))</w:t>
-      </w:r>
-    </w:p>
-    <w:p>
-      <w:r>
-        <w:lastRenderedPageBreak/>
+        <w:t>emit(</w:t>
+      </w:r>
+      <w:proofErr w:type="spellStart"/>
+      <w:proofErr w:type="gramStart"/>
+      <w:r>
+        <w:t>state.copyWith</w:t>
+      </w:r>
+      <w:proofErr w:type="spellEnd"/>
+      <w:proofErr w:type="gramEnd"/>
+      <w:r>
+        <w:t>(...))</w:t>
+      </w:r>
+    </w:p>
+    <w:p>
+      <w:r>
         <w:pict w14:anchorId="18F3F740">
           <v:rect id="_x0000_i1040" style="width:0;height:1.5pt" o:hralign="center" o:hrstd="t" o:hr="t" fillcolor="#a0a0a0" stroked="f"/>
         </w:pict>
@@ -1715,8 +2945,29 @@
       </w:r>
     </w:p>
     <w:p>
-      <w:r>
-        <w:t>BlocBuilder&lt;HajjCubit, HajjState&gt;</w:t>
+      <w:proofErr w:type="spellStart"/>
+      <w:r>
+        <w:t>BlocBuilder</w:t>
+      </w:r>
+      <w:proofErr w:type="spellEnd"/>
+      <w:r>
+        <w:t>&lt;</w:t>
+      </w:r>
+      <w:proofErr w:type="spellStart"/>
+      <w:r>
+        <w:t>HajjCubit</w:t>
+      </w:r>
+      <w:proofErr w:type="spellEnd"/>
+      <w:r>
+        <w:t xml:space="preserve">, </w:t>
+      </w:r>
+      <w:proofErr w:type="spellStart"/>
+      <w:r>
+        <w:t>HajjState</w:t>
+      </w:r>
+      <w:proofErr w:type="spellEnd"/>
+      <w:r>
+        <w:t>&gt;</w:t>
       </w:r>
     </w:p>
     <w:p>
@@ -1755,8 +3006,13 @@
       </w:r>
     </w:p>
     <w:p>
-      <w:r>
-        <w:t>changeBottomIndex(index)</w:t>
+      <w:proofErr w:type="spellStart"/>
+      <w:r>
+        <w:t>changeBottomIndex</w:t>
+      </w:r>
+      <w:proofErr w:type="spellEnd"/>
+      <w:r>
+        <w:t>(index)</w:t>
       </w:r>
     </w:p>
     <w:p>
@@ -1894,6 +3150,7 @@
         <w:rPr>
           <w:rFonts w:ascii="Segoe UI Emoji" w:hAnsi="Segoe UI Emoji" w:cs="Segoe UI Emoji"/>
         </w:rPr>
+        <w:lastRenderedPageBreak/>
         <w:t>🧳</w:t>
       </w:r>
       <w:r>
@@ -1995,7 +3252,6 @@
           <w:b/>
           <w:bCs/>
         </w:rPr>
-        <w:lastRenderedPageBreak/>
         <w:t>Add Pages</w:t>
       </w:r>
     </w:p>
@@ -2013,11 +3269,27 @@
       </w:r>
       <w:r>
         <w:br/>
-        <w:t xml:space="preserve">   safar/</w:t>
-      </w:r>
-      <w:r>
-        <w:br/>
-        <w:t xml:space="preserve">   makkah/</w:t>
+        <w:t xml:space="preserve">   </w:t>
+      </w:r>
+      <w:proofErr w:type="spellStart"/>
+      <w:r>
+        <w:t>safar</w:t>
+      </w:r>
+      <w:proofErr w:type="spellEnd"/>
+      <w:r>
+        <w:t>/</w:t>
+      </w:r>
+      <w:r>
+        <w:br/>
+        <w:t xml:space="preserve">   </w:t>
+      </w:r>
+      <w:proofErr w:type="spellStart"/>
+      <w:r>
+        <w:t>makkah</w:t>
+      </w:r>
+      <w:proofErr w:type="spellEnd"/>
+      <w:r>
+        <w:t>/</w:t>
       </w:r>
     </w:p>
     <w:p>
@@ -2043,8 +3315,13 @@
       </w:r>
     </w:p>
     <w:p>
-      <w:r>
-        <w:t>Navigator.push(...)</w:t>
+      <w:proofErr w:type="spellStart"/>
+      <w:r>
+        <w:t>Navigator.push</w:t>
+      </w:r>
+      <w:proofErr w:type="spellEnd"/>
+      <w:r>
+        <w:t>(...)</w:t>
       </w:r>
     </w:p>
     <w:p/>
@@ -2226,19 +3503,28 @@
       </w:r>
     </w:p>
     <w:p>
+      <w:proofErr w:type="gramStart"/>
       <w:r>
         <w:t>E:.</w:t>
       </w:r>
-    </w:p>
-    <w:p>
-      <w:r>
-        <w:t>│   main.dart</w:t>
-      </w:r>
+      <w:proofErr w:type="gramEnd"/>
     </w:p>
     <w:p>
       <w:r>
         <w:t xml:space="preserve">│   </w:t>
       </w:r>
+      <w:proofErr w:type="spellStart"/>
+      <w:proofErr w:type="gramStart"/>
+      <w:r>
+        <w:t>main.dart</w:t>
+      </w:r>
+      <w:proofErr w:type="spellEnd"/>
+      <w:proofErr w:type="gramEnd"/>
+    </w:p>
+    <w:p>
+      <w:r>
+        <w:t xml:space="preserve">│   </w:t>
+      </w:r>
     </w:p>
     <w:p>
       <w:r>
@@ -2279,18 +3565,48 @@
     </w:p>
     <w:p>
       <w:r>
-        <w:t>│   │       app_colors.dart</w:t>
-      </w:r>
-    </w:p>
-    <w:p>
-      <w:r>
-        <w:t>│   │       app_images.dart</w:t>
-      </w:r>
-    </w:p>
-    <w:p>
-      <w:r>
-        <w:t>│   │       app_strings.dart</w:t>
-      </w:r>
+        <w:t xml:space="preserve">│   │       </w:t>
+      </w:r>
+      <w:proofErr w:type="spellStart"/>
+      <w:r>
+        <w:t>app_</w:t>
+      </w:r>
+      <w:proofErr w:type="gramStart"/>
+      <w:r>
+        <w:t>colors.dart</w:t>
+      </w:r>
+      <w:proofErr w:type="spellEnd"/>
+      <w:proofErr w:type="gramEnd"/>
+    </w:p>
+    <w:p>
+      <w:r>
+        <w:t xml:space="preserve">│   │       </w:t>
+      </w:r>
+      <w:proofErr w:type="spellStart"/>
+      <w:r>
+        <w:t>app_</w:t>
+      </w:r>
+      <w:proofErr w:type="gramStart"/>
+      <w:r>
+        <w:t>images.dart</w:t>
+      </w:r>
+      <w:proofErr w:type="spellEnd"/>
+      <w:proofErr w:type="gramEnd"/>
+    </w:p>
+    <w:p>
+      <w:r>
+        <w:t xml:space="preserve">│   │       </w:t>
+      </w:r>
+      <w:proofErr w:type="spellStart"/>
+      <w:r>
+        <w:t>app_</w:t>
+      </w:r>
+      <w:proofErr w:type="gramStart"/>
+      <w:r>
+        <w:t>strings.dart</w:t>
+      </w:r>
+      <w:proofErr w:type="spellEnd"/>
+      <w:proofErr w:type="gramEnd"/>
     </w:p>
     <w:p>
       <w:r>
@@ -2319,8 +3635,18 @@
     </w:p>
     <w:p>
       <w:r>
-        <w:t>│   │       dio_client.dart</w:t>
-      </w:r>
+        <w:t xml:space="preserve">│   │       </w:t>
+      </w:r>
+      <w:proofErr w:type="spellStart"/>
+      <w:r>
+        <w:t>dio_</w:t>
+      </w:r>
+      <w:proofErr w:type="gramStart"/>
+      <w:r>
+        <w:t>client.dart</w:t>
+      </w:r>
+      <w:proofErr w:type="spellEnd"/>
+      <w:proofErr w:type="gramEnd"/>
     </w:p>
     <w:p>
       <w:r>
@@ -2329,6 +3655,7 @@
     </w:p>
     <w:p>
       <w:r>
+        <w:lastRenderedPageBreak/>
         <w:t xml:space="preserve">│   </w:t>
       </w:r>
       <w:r>
@@ -2349,8 +3676,18 @@
     </w:p>
     <w:p>
       <w:r>
-        <w:t>│   │       app_theme.dart</w:t>
-      </w:r>
+        <w:t xml:space="preserve">│   │       </w:t>
+      </w:r>
+      <w:proofErr w:type="spellStart"/>
+      <w:r>
+        <w:t>app_</w:t>
+      </w:r>
+      <w:proofErr w:type="gramStart"/>
+      <w:r>
+        <w:t>theme.dart</w:t>
+      </w:r>
+      <w:proofErr w:type="spellEnd"/>
+      <w:proofErr w:type="gramEnd"/>
     </w:p>
     <w:p>
       <w:r>
@@ -2364,8 +3701,15 @@
     </w:p>
     <w:p>
       <w:r>
-        <w:t>│           helper.dart</w:t>
-      </w:r>
+        <w:t xml:space="preserve">│           </w:t>
+      </w:r>
+      <w:proofErr w:type="spellStart"/>
+      <w:proofErr w:type="gramStart"/>
+      <w:r>
+        <w:t>helper.dart</w:t>
+      </w:r>
+      <w:proofErr w:type="spellEnd"/>
+      <w:proofErr w:type="gramEnd"/>
     </w:p>
     <w:p>
       <w:r>
@@ -2391,164 +3735,263 @@
     </w:p>
     <w:p>
       <w:r>
+        <w:t>│   └───hajj</w:t>
+      </w:r>
+    </w:p>
+    <w:p>
+      <w:r>
+        <w:t xml:space="preserve">│       </w:t>
+      </w:r>
+      <w:r>
+        <w:rPr>
+          <w:rFonts w:ascii="MS Gothic" w:eastAsia="MS Gothic" w:hAnsi="MS Gothic" w:cs="MS Gothic" w:hint="eastAsia"/>
+        </w:rPr>
+        <w:t>├</w:t>
+      </w:r>
+      <w:r>
+        <w:rPr>
+          <w:rFonts w:ascii="Calibri" w:hAnsi="Calibri" w:cs="Calibri"/>
+        </w:rPr>
+        <w:t>───</w:t>
+      </w:r>
+      <w:r>
+        <w:t>data</w:t>
+      </w:r>
+    </w:p>
+    <w:p>
+      <w:r>
+        <w:t xml:space="preserve">│       │   </w:t>
+      </w:r>
+      <w:r>
+        <w:rPr>
+          <w:rFonts w:ascii="MS Gothic" w:eastAsia="MS Gothic" w:hAnsi="MS Gothic" w:cs="MS Gothic" w:hint="eastAsia"/>
+        </w:rPr>
+        <w:t>├</w:t>
+      </w:r>
+      <w:r>
+        <w:rPr>
+          <w:rFonts w:ascii="Calibri" w:hAnsi="Calibri" w:cs="Calibri"/>
+        </w:rPr>
+        <w:t>───</w:t>
+      </w:r>
+      <w:proofErr w:type="spellStart"/>
+      <w:r>
+        <w:t>data_sources</w:t>
+      </w:r>
+      <w:proofErr w:type="spellEnd"/>
+    </w:p>
+    <w:p>
+      <w:r>
+        <w:t xml:space="preserve">│       │   │       </w:t>
+      </w:r>
+      <w:proofErr w:type="spellStart"/>
+      <w:r>
+        <w:t>menu_</w:t>
+      </w:r>
+      <w:proofErr w:type="gramStart"/>
+      <w:r>
+        <w:t>data.dart</w:t>
+      </w:r>
+      <w:proofErr w:type="spellEnd"/>
+      <w:proofErr w:type="gramEnd"/>
+    </w:p>
+    <w:p>
+      <w:r>
+        <w:t>│       │   │</w:t>
+      </w:r>
+    </w:p>
+    <w:p>
+      <w:r>
+        <w:t xml:space="preserve">│       │   </w:t>
+      </w:r>
+      <w:r>
+        <w:rPr>
+          <w:rFonts w:ascii="MS Gothic" w:eastAsia="MS Gothic" w:hAnsi="MS Gothic" w:cs="MS Gothic" w:hint="eastAsia"/>
+        </w:rPr>
+        <w:t>├</w:t>
+      </w:r>
+      <w:r>
+        <w:rPr>
+          <w:rFonts w:ascii="Calibri" w:hAnsi="Calibri" w:cs="Calibri"/>
+        </w:rPr>
+        <w:t>───</w:t>
+      </w:r>
+      <w:r>
+        <w:t>models</w:t>
+      </w:r>
+    </w:p>
+    <w:p>
+      <w:r>
+        <w:t xml:space="preserve">│       │   │       </w:t>
+      </w:r>
+      <w:proofErr w:type="spellStart"/>
+      <w:r>
+        <w:t>hajj_package_</w:t>
+      </w:r>
+      <w:proofErr w:type="gramStart"/>
+      <w:r>
+        <w:t>model.dart</w:t>
+      </w:r>
+      <w:proofErr w:type="spellEnd"/>
+      <w:proofErr w:type="gramEnd"/>
+    </w:p>
+    <w:p>
+      <w:r>
+        <w:t xml:space="preserve">│       │   │       </w:t>
+      </w:r>
+      <w:proofErr w:type="spellStart"/>
+      <w:r>
+        <w:t>menu_item_</w:t>
+      </w:r>
+      <w:proofErr w:type="gramStart"/>
+      <w:r>
+        <w:t>model.dart</w:t>
+      </w:r>
+      <w:proofErr w:type="spellEnd"/>
+      <w:proofErr w:type="gramEnd"/>
+    </w:p>
+    <w:p>
+      <w:r>
+        <w:t>│       │   │</w:t>
+      </w:r>
+    </w:p>
+    <w:p>
+      <w:r>
+        <w:t>│       │   └───repositories</w:t>
+      </w:r>
+    </w:p>
+    <w:p>
+      <w:r>
+        <w:t xml:space="preserve">│       </w:t>
+      </w:r>
+      <w:r>
+        <w:rPr>
+          <w:rFonts w:ascii="MS Gothic" w:eastAsia="MS Gothic" w:hAnsi="MS Gothic" w:cs="MS Gothic" w:hint="eastAsia"/>
+        </w:rPr>
+        <w:t>├</w:t>
+      </w:r>
+      <w:r>
+        <w:rPr>
+          <w:rFonts w:ascii="Calibri" w:hAnsi="Calibri" w:cs="Calibri"/>
+        </w:rPr>
+        <w:t>───</w:t>
+      </w:r>
+      <w:proofErr w:type="spellStart"/>
+      <w:r>
+        <w:t>doman</w:t>
+      </w:r>
+      <w:proofErr w:type="spellEnd"/>
+    </w:p>
+    <w:p>
+      <w:r>
+        <w:t>│       │   └───entities</w:t>
+      </w:r>
+    </w:p>
+    <w:p>
+      <w:r>
+        <w:t>│       └───presentation</w:t>
+      </w:r>
+    </w:p>
+    <w:p>
+      <w:r>
+        <w:t xml:space="preserve">│           </w:t>
+      </w:r>
+      <w:r>
+        <w:rPr>
+          <w:rFonts w:ascii="MS Gothic" w:eastAsia="MS Gothic" w:hAnsi="MS Gothic" w:cs="MS Gothic" w:hint="eastAsia"/>
+        </w:rPr>
+        <w:t>├</w:t>
+      </w:r>
+      <w:r>
+        <w:rPr>
+          <w:rFonts w:ascii="Calibri" w:hAnsi="Calibri" w:cs="Calibri"/>
+        </w:rPr>
+        <w:t>───</w:t>
+      </w:r>
+      <w:r>
+        <w:t>cubit</w:t>
+      </w:r>
+    </w:p>
+    <w:p>
+      <w:r>
+        <w:t>│           │   └───hajj</w:t>
+      </w:r>
+    </w:p>
+    <w:p>
+      <w:r>
+        <w:t xml:space="preserve">│           │           </w:t>
+      </w:r>
+      <w:proofErr w:type="spellStart"/>
+      <w:r>
+        <w:t>hajj_</w:t>
+      </w:r>
+      <w:proofErr w:type="gramStart"/>
+      <w:r>
+        <w:t>cubit.dart</w:t>
+      </w:r>
+      <w:proofErr w:type="spellEnd"/>
+      <w:proofErr w:type="gramEnd"/>
+    </w:p>
+    <w:p>
+      <w:r>
+        <w:t xml:space="preserve">│           │           </w:t>
+      </w:r>
+      <w:proofErr w:type="spellStart"/>
+      <w:r>
+        <w:t>hajj_</w:t>
+      </w:r>
+      <w:proofErr w:type="gramStart"/>
+      <w:r>
+        <w:t>state.dart</w:t>
+      </w:r>
+      <w:proofErr w:type="spellEnd"/>
+      <w:proofErr w:type="gramEnd"/>
+    </w:p>
+    <w:p>
+      <w:r>
+        <w:t>│           │</w:t>
+      </w:r>
+    </w:p>
+    <w:p>
+      <w:r>
+        <w:t xml:space="preserve">│           </w:t>
+      </w:r>
+      <w:r>
+        <w:rPr>
+          <w:rFonts w:ascii="MS Gothic" w:eastAsia="MS Gothic" w:hAnsi="MS Gothic" w:cs="MS Gothic" w:hint="eastAsia"/>
+        </w:rPr>
+        <w:t>├</w:t>
+      </w:r>
+      <w:r>
+        <w:rPr>
+          <w:rFonts w:ascii="Calibri" w:hAnsi="Calibri" w:cs="Calibri"/>
+        </w:rPr>
+        <w:t>───</w:t>
+      </w:r>
+      <w:r>
+        <w:t>pages</w:t>
+      </w:r>
+    </w:p>
+    <w:p>
+      <w:r>
         <w:lastRenderedPageBreak/>
-        <w:t>│   └───hajj</w:t>
-      </w:r>
-    </w:p>
-    <w:p>
-      <w:r>
-        <w:t xml:space="preserve">│       </w:t>
-      </w:r>
-      <w:r>
-        <w:rPr>
-          <w:rFonts w:ascii="MS Gothic" w:eastAsia="MS Gothic" w:hAnsi="MS Gothic" w:cs="MS Gothic" w:hint="eastAsia"/>
-        </w:rPr>
-        <w:t>├</w:t>
-      </w:r>
-      <w:r>
-        <w:rPr>
-          <w:rFonts w:ascii="Calibri" w:hAnsi="Calibri" w:cs="Calibri"/>
-        </w:rPr>
-        <w:t>───</w:t>
-      </w:r>
-      <w:r>
-        <w:t>data</w:t>
-      </w:r>
-    </w:p>
-    <w:p>
-      <w:r>
-        <w:t xml:space="preserve">│       │   </w:t>
-      </w:r>
-      <w:r>
-        <w:rPr>
-          <w:rFonts w:ascii="MS Gothic" w:eastAsia="MS Gothic" w:hAnsi="MS Gothic" w:cs="MS Gothic" w:hint="eastAsia"/>
-        </w:rPr>
-        <w:t>├</w:t>
-      </w:r>
-      <w:r>
-        <w:rPr>
-          <w:rFonts w:ascii="Calibri" w:hAnsi="Calibri" w:cs="Calibri"/>
-        </w:rPr>
-        <w:t>───</w:t>
-      </w:r>
-      <w:r>
-        <w:t>data_sources</w:t>
-      </w:r>
-    </w:p>
-    <w:p>
-      <w:r>
-        <w:t>│       │   │       menu_data.dart</w:t>
-      </w:r>
-    </w:p>
-    <w:p>
-      <w:r>
-        <w:t>│       │   │</w:t>
-      </w:r>
-    </w:p>
-    <w:p>
-      <w:r>
-        <w:t xml:space="preserve">│       │   </w:t>
-      </w:r>
-      <w:r>
-        <w:rPr>
-          <w:rFonts w:ascii="MS Gothic" w:eastAsia="MS Gothic" w:hAnsi="MS Gothic" w:cs="MS Gothic" w:hint="eastAsia"/>
-        </w:rPr>
-        <w:t>├</w:t>
-      </w:r>
-      <w:r>
-        <w:rPr>
-          <w:rFonts w:ascii="Calibri" w:hAnsi="Calibri" w:cs="Calibri"/>
-        </w:rPr>
-        <w:t>───</w:t>
-      </w:r>
-      <w:r>
-        <w:t>models</w:t>
-      </w:r>
-    </w:p>
-    <w:p>
-      <w:r>
-        <w:t>│       │   │       hajj_package_model.dart</w:t>
-      </w:r>
-    </w:p>
-    <w:p>
-      <w:r>
-        <w:t>│       │   │       menu_item_model.dart</w:t>
-      </w:r>
-    </w:p>
-    <w:p>
-      <w:r>
-        <w:t>│       │   │</w:t>
-      </w:r>
-    </w:p>
-    <w:p>
-      <w:r>
-        <w:t>│       │   └───repositories</w:t>
-      </w:r>
-    </w:p>
-    <w:p>
-      <w:r>
-        <w:t xml:space="preserve">│       </w:t>
-      </w:r>
-      <w:r>
-        <w:rPr>
-          <w:rFonts w:ascii="MS Gothic" w:eastAsia="MS Gothic" w:hAnsi="MS Gothic" w:cs="MS Gothic" w:hint="eastAsia"/>
-        </w:rPr>
-        <w:t>├</w:t>
-      </w:r>
-      <w:r>
-        <w:rPr>
-          <w:rFonts w:ascii="Calibri" w:hAnsi="Calibri" w:cs="Calibri"/>
-        </w:rPr>
-        <w:t>───</w:t>
-      </w:r>
-      <w:r>
-        <w:t>doman</w:t>
-      </w:r>
-    </w:p>
-    <w:p>
-      <w:r>
-        <w:t>│       │   └───entities</w:t>
-      </w:r>
-    </w:p>
-    <w:p>
-      <w:r>
-        <w:t>│       └───presentation</w:t>
-      </w:r>
-    </w:p>
-    <w:p>
-      <w:r>
-        <w:t xml:space="preserve">│           </w:t>
-      </w:r>
-      <w:r>
-        <w:rPr>
-          <w:rFonts w:ascii="MS Gothic" w:eastAsia="MS Gothic" w:hAnsi="MS Gothic" w:cs="MS Gothic" w:hint="eastAsia"/>
-        </w:rPr>
-        <w:t>├</w:t>
-      </w:r>
-      <w:r>
-        <w:rPr>
-          <w:rFonts w:ascii="Calibri" w:hAnsi="Calibri" w:cs="Calibri"/>
-        </w:rPr>
-        <w:t>───</w:t>
-      </w:r>
-      <w:r>
-        <w:t>cubit</w:t>
-      </w:r>
-    </w:p>
-    <w:p>
-      <w:r>
-        <w:t>│           │   └───hajj</w:t>
-      </w:r>
-    </w:p>
-    <w:p>
-      <w:r>
-        <w:t>│           │           hajj_cubit.dart</w:t>
-      </w:r>
-    </w:p>
-    <w:p>
-      <w:r>
-        <w:t>│           │           hajj_state.dart</w:t>
-      </w:r>
+        <w:t>│           │   └───home</w:t>
+      </w:r>
+    </w:p>
+    <w:p>
+      <w:r>
+        <w:t xml:space="preserve">│           │           </w:t>
+      </w:r>
+      <w:proofErr w:type="spellStart"/>
+      <w:r>
+        <w:t>home_</w:t>
+      </w:r>
+      <w:proofErr w:type="gramStart"/>
+      <w:r>
+        <w:t>screen.dart</w:t>
+      </w:r>
+      <w:proofErr w:type="spellEnd"/>
+      <w:proofErr w:type="gramEnd"/>
     </w:p>
     <w:p>
       <w:r>
@@ -2557,53 +4000,38 @@
     </w:p>
     <w:p>
       <w:r>
-        <w:t xml:space="preserve">│           </w:t>
-      </w:r>
-      <w:r>
-        <w:rPr>
-          <w:rFonts w:ascii="MS Gothic" w:eastAsia="MS Gothic" w:hAnsi="MS Gothic" w:cs="MS Gothic" w:hint="eastAsia"/>
-        </w:rPr>
-        <w:t>├</w:t>
-      </w:r>
-      <w:r>
-        <w:rPr>
-          <w:rFonts w:ascii="Calibri" w:hAnsi="Calibri" w:cs="Calibri"/>
-        </w:rPr>
-        <w:t>───</w:t>
-      </w:r>
-      <w:r>
-        <w:t>pages</w:t>
-      </w:r>
-    </w:p>
-    <w:p>
-      <w:r>
-        <w:t>│           │   └───home</w:t>
-      </w:r>
-    </w:p>
-    <w:p>
-      <w:r>
-        <w:t>│           │           home_screen.dart</w:t>
-      </w:r>
-    </w:p>
-    <w:p>
-      <w:r>
-        <w:t>│           │</w:t>
-      </w:r>
-    </w:p>
-    <w:p>
-      <w:r>
         <w:t>│           └───widgets</w:t>
       </w:r>
     </w:p>
     <w:p>
       <w:r>
-        <w:t>│                   bottom_menu_tile.dart</w:t>
-      </w:r>
-    </w:p>
-    <w:p>
-      <w:r>
-        <w:t>│                   top_menu_card.dart</w:t>
-      </w:r>
+        <w:t xml:space="preserve">│                   </w:t>
+      </w:r>
+      <w:proofErr w:type="spellStart"/>
+      <w:r>
+        <w:t>bottom_menu_</w:t>
+      </w:r>
+      <w:proofErr w:type="gramStart"/>
+      <w:r>
+        <w:t>tile.dart</w:t>
+      </w:r>
+      <w:proofErr w:type="spellEnd"/>
+      <w:proofErr w:type="gramEnd"/>
+    </w:p>
+    <w:p>
+      <w:r>
+        <w:t xml:space="preserve">│                   </w:t>
+      </w:r>
+      <w:proofErr w:type="spellStart"/>
+      <w:r>
+        <w:t>top_menu_</w:t>
+      </w:r>
+      <w:proofErr w:type="gramStart"/>
+      <w:r>
+        <w:t>card.dart</w:t>
+      </w:r>
+      <w:proofErr w:type="spellEnd"/>
+      <w:proofErr w:type="gramEnd"/>
     </w:p>
     <w:p>
       <w:r>
@@ -2612,14 +4040,23 @@
     </w:p>
     <w:p>
       <w:r>
-        <w:lastRenderedPageBreak/>
         <w:t>└───services</w:t>
       </w:r>
     </w:p>
     <w:p>
       <w:r>
-        <w:t xml:space="preserve">        api_service.dart</w:t>
-      </w:r>
+        <w:t xml:space="preserve">        </w:t>
+      </w:r>
+      <w:proofErr w:type="spellStart"/>
+      <w:r>
+        <w:t>api_</w:t>
+      </w:r>
+      <w:proofErr w:type="gramStart"/>
+      <w:r>
+        <w:t>service.dart</w:t>
+      </w:r>
+      <w:proofErr w:type="spellEnd"/>
+      <w:proofErr w:type="gramEnd"/>
     </w:p>
     <w:p/>
     <w:p>

</xml_diff>